<commit_message>
Add virtual environment setup to documentation
</commit_message>
<xml_diff>
--- a/docs/Техническое задание.docx
+++ b/docs/Техническое задание.docx
@@ -289,10 +289,7 @@
               <w:jc w:val="center"/>
             </w:pPr>
             <w:r>
-              <w:t xml:space="preserve">Кафедра программного </w:t>
-            </w:r>
-            <w:r>
-              <w:t>обеспечения систем радиоэлектронной аппаратуры</w:t>
+              <w:t>Кафедра программного обеспечения систем радиоэлектронной аппаратуры</w:t>
             </w:r>
           </w:p>
         </w:tc>
@@ -663,10 +660,7 @@
               <w:jc w:val="center"/>
             </w:pPr>
             <w:r>
-              <w:t xml:space="preserve">Морозов </w:t>
-            </w:r>
-            <w:r>
-              <w:t>Вадим Константинович</w:t>
+              <w:t>Морозов Вадим Константинович</w:t>
             </w:r>
           </w:p>
         </w:tc>
@@ -1201,15 +1195,7 @@
                 <w:sz w:val="16"/>
                 <w:szCs w:val="16"/>
               </w:rPr>
-              <w:t xml:space="preserve">Фамилия Имя </w:t>
-            </w:r>
-            <w:r>
-              <w:rPr>
-                <w:i/>
-                <w:sz w:val="16"/>
-                <w:szCs w:val="16"/>
-              </w:rPr>
-              <w:t>Отчество</w:t>
+              <w:t>Фамилия Имя Отчество</w:t>
             </w:r>
           </w:p>
         </w:tc>
@@ -1848,15 +1834,7 @@
                 <w:sz w:val="16"/>
                 <w:szCs w:val="16"/>
               </w:rPr>
-              <w:t xml:space="preserve">ученая степень, ученое </w:t>
-            </w:r>
-            <w:r>
-              <w:rPr>
-                <w:i/>
-                <w:sz w:val="16"/>
-                <w:szCs w:val="16"/>
-              </w:rPr>
-              <w:t>звание, должность</w:t>
+              <w:t>ученая степень, ученое звание, должность</w:t>
             </w:r>
           </w:p>
         </w:tc>
@@ -2306,14 +2284,7 @@
                 <w:rStyle w:val="af3"/>
                 <w:rFonts w:ascii="Times New Roman" w:hAnsi="Times New Roman"/>
               </w:rPr>
-              <w:t xml:space="preserve">3.5 </w:t>
-            </w:r>
-            <w:r>
-              <w:rPr>
-                <w:rStyle w:val="af3"/>
-                <w:rFonts w:ascii="Times New Roman" w:hAnsi="Times New Roman"/>
-              </w:rPr>
-              <w:t>Требования к информационной и программной совместимости</w:t>
+              <w:t>3.5 Требования к информационной и программной совместимости</w:t>
             </w:r>
             <w:r>
               <w:rPr>
@@ -2490,15 +2461,7 @@
                 <w:sz w:val="28"/>
                 <w:szCs w:val="28"/>
               </w:rPr>
-              <w:t>5 СТАДИИ И ЭТАПЫ</w:t>
-            </w:r>
-            <w:r>
-              <w:rPr>
-                <w:rStyle w:val="af3"/>
-                <w:sz w:val="28"/>
-                <w:szCs w:val="28"/>
-              </w:rPr>
-              <w:t xml:space="preserve"> РАЗРАБОТКИ</w:t>
+              <w:t>5 СТАДИИ И ЭТАПЫ РАЗРАБОТКИ</w:t>
             </w:r>
             <w:r>
               <w:rPr>
@@ -2922,63 +2885,33 @@
             </w:tabs>
             <w:spacing w:line="360" w:lineRule="auto"/>
           </w:pPr>
-          <w:r>
-            <w:rPr>
-              <w:rStyle w:val="af3"/>
-              <w:sz w:val="28"/>
-              <w:szCs w:val="28"/>
-            </w:rPr>
-            <w:fldChar w:fldCharType="begin"/>
-          </w:r>
-          <w:r>
-            <w:rPr>
-              <w:rStyle w:val="af3"/>
-              <w:sz w:val="28"/>
-              <w:szCs w:val="28"/>
-            </w:rPr>
-            <w:instrText xml:space="preserve"> HYPERLINK \l "__RefHeading___Toc2082_1315473863" \h </w:instrText>
-          </w:r>
-          <w:r>
-            <w:rPr>
-              <w:rStyle w:val="af3"/>
-              <w:sz w:val="28"/>
-              <w:szCs w:val="28"/>
-            </w:rPr>
-            <w:fldChar w:fldCharType="separate"/>
-          </w:r>
-          <w:r>
-            <w:rPr>
-              <w:rStyle w:val="af3"/>
-              <w:sz w:val="28"/>
-              <w:szCs w:val="28"/>
-            </w:rPr>
-            <w:t>СПИСОК ЛИТЕРАТУРЫ</w:t>
-          </w:r>
-          <w:r>
-            <w:rPr>
-              <w:rStyle w:val="af3"/>
-              <w:sz w:val="28"/>
-              <w:szCs w:val="28"/>
-            </w:rPr>
-            <w:tab/>
-            <w:t>2</w:t>
-          </w:r>
-          <w:r>
-            <w:rPr>
-              <w:rStyle w:val="af3"/>
-              <w:sz w:val="28"/>
-              <w:szCs w:val="28"/>
-            </w:rPr>
-            <w:t>4</w:t>
-          </w:r>
-          <w:r>
-            <w:rPr>
-              <w:rStyle w:val="af3"/>
-              <w:sz w:val="28"/>
-              <w:szCs w:val="28"/>
-            </w:rPr>
-            <w:fldChar w:fldCharType="end"/>
-          </w:r>
+          <w:hyperlink w:anchor="__RefHeading___Toc2082_1315473863">
+            <w:r>
+              <w:rPr>
+                <w:rStyle w:val="af3"/>
+                <w:sz w:val="28"/>
+                <w:szCs w:val="28"/>
+              </w:rPr>
+              <w:t>СПИСОК ЛИТЕРАТУРЫ</w:t>
+            </w:r>
+            <w:r>
+              <w:rPr>
+                <w:rStyle w:val="af3"/>
+                <w:sz w:val="28"/>
+                <w:szCs w:val="28"/>
+              </w:rPr>
+              <w:tab/>
+              <w:t>2</w:t>
+            </w:r>
+            <w:r>
+              <w:rPr>
+                <w:rStyle w:val="af3"/>
+                <w:sz w:val="28"/>
+                <w:szCs w:val="28"/>
+              </w:rPr>
+              <w:t>4</w:t>
+            </w:r>
+          </w:hyperlink>
           <w:r>
             <w:rPr>
               <w:rStyle w:val="af3"/>
@@ -2988,8 +2921,6 @@
             <w:fldChar w:fldCharType="end"/>
           </w:r>
         </w:p>
-        <w:bookmarkStart w:id="1" w:name="_GoBack" w:displacedByCustomXml="next"/>
-        <w:bookmarkEnd w:id="1" w:displacedByCustomXml="next"/>
       </w:sdtContent>
     </w:sdt>
     <w:p>
@@ -3009,8 +2940,8 @@
       <w:pPr>
         <w:pStyle w:val="aff0"/>
       </w:pPr>
-      <w:bookmarkStart w:id="2" w:name="__RefHeading___Toc709_2206354072"/>
-      <w:bookmarkEnd w:id="2"/>
+      <w:bookmarkStart w:id="1" w:name="__RefHeading___Toc709_2206354072"/>
+      <w:bookmarkEnd w:id="1"/>
       <w:r>
         <w:lastRenderedPageBreak/>
         <w:t>ВВЕДЕНИЕ</w:t>
@@ -3031,25 +2962,7 @@
         <w:rPr>
           <w:sz w:val="28"/>
         </w:rPr>
-        <w:t xml:space="preserve">Современные высшие учебные заведения часто представляют собой большие здания, состоящие из множества корпусов, этажей и помещений. Российский технологический </w:t>
-      </w:r>
-      <w:r>
-        <w:rPr>
-          <w:sz w:val="28"/>
-        </w:rPr>
-        <w:t>университет МИРЭА, являясь одним из ведущих технических вузов страны, не является исключением. Кампус университета, расположенный по адресу: г. Москва, ул. Стромынка, д. 20, — это многофункциональное образовательное пространство, в котором ежедневно находя</w:t>
-      </w:r>
-      <w:r>
-        <w:rPr>
-          <w:sz w:val="28"/>
-        </w:rPr>
-        <w:t>тся тысячи студентов, преподавателей и гостей. Для новых студентов, абитуриентов, приглашенных лекторов, и, нередко, для части сотрудников ориентирование по аудиториям, лабораториям, корпусам и административным кабинетам может стать сложной задачей, отнима</w:t>
-      </w:r>
-      <w:r>
-        <w:rPr>
-          <w:sz w:val="28"/>
-        </w:rPr>
-        <w:t>ющей ценное время и создающей лишний стресс, особенно в условиях напряженного учебного графика.</w:t>
+        <w:t>Современные высшие учебные заведения часто представляют собой большие здания, состоящие из множества корпусов, этажей и помещений. Российский технологический университет МИРЭА, являясь одним из ведущих технических вузов страны, не является исключением. Кампус университета, расположенный по адресу: г. Москва, ул. Стромынка, д. 20, — это многофункциональное образовательное пространство, в котором ежедневно находятся тысячи студентов, преподавателей и гостей. Для новых студентов, абитуриентов, приглашенных лекторов, и, нередко, для части сотрудников ориентирование по аудиториям, лабораториям, корпусам и административным кабинетам может стать сложной задачей, отнимающей ценное время и создающей лишний стресс, особенно в условиях напряженного учебного графика.</w:t>
       </w:r>
     </w:p>
     <w:p>
@@ -3090,13 +3003,7 @@
         <w:rPr>
           <w:sz w:val="28"/>
         </w:rPr>
-        <w:t>», в настоящее время активно решается с помощью цифровых технологий. В то время как дл</w:t>
-      </w:r>
-      <w:r>
-        <w:rPr>
-          <w:sz w:val="28"/>
-        </w:rPr>
-        <w:t xml:space="preserve">я улиц давно существуют подробные карты (например, </w:t>
+        <w:t xml:space="preserve">», в настоящее время активно решается с помощью цифровых технологий. В то время как для улиц давно существуют подробные карты (например, </w:t>
       </w:r>
       <w:proofErr w:type="spellStart"/>
       <w:r>
@@ -3138,13 +3045,7 @@
         <w:rPr>
           <w:sz w:val="28"/>
         </w:rPr>
-        <w:t xml:space="preserve">), точная и удобная навигация внутри помещений остается нишей, требующей специализированных решений. Существующие способы ориентации — такие как статические таблицы и указатели — </w:t>
-      </w:r>
-      <w:r>
-        <w:rPr>
-          <w:sz w:val="28"/>
-        </w:rPr>
-        <w:t>зачастую не обладают необходимой информативностью и детализацией. Они не могут предоставить персонализированный маршрут от текущего местоположения человека до конкретной цели, учитывая особенности планировки этажа.</w:t>
+        <w:t>), точная и удобная навигация внутри помещений остается нишей, требующей специализированных решений. Существующие способы ориентации — такие как статические таблицы и указатели — зачастую не обладают необходимой информативностью и детализацией. Они не могут предоставить персонализированный маршрут от текущего местоположения человека до конкретной цели, учитывая особенности планировки этажа.</w:t>
       </w:r>
     </w:p>
     <w:p>
@@ -3157,13 +3058,7 @@
         <w:rPr>
           <w:sz w:val="28"/>
         </w:rPr>
-        <w:t>Данный проект предлагает разработку специ</w:t>
-      </w:r>
-      <w:r>
-        <w:rPr>
-          <w:sz w:val="28"/>
-        </w:rPr>
-        <w:t>ализированного веб-приложения – «Навигатор для кампуса РТУ МИРЭА "</w:t>
+        <w:t>Данный проект предлагает разработку специализированного веб-приложения – «Навигатор для кампуса РТУ МИРЭА "</w:t>
       </w:r>
       <w:proofErr w:type="spellStart"/>
       <w:r>
@@ -3191,13 +3086,7 @@
         <w:rPr>
           <w:sz w:val="28"/>
         </w:rPr>
-        <w:t>"». Это программное изделие предназначено для обеспечения комфортного и эффективного перемещения по нескольким неполным этажам кампуса (карта может не затрагивать некото</w:t>
-      </w:r>
-      <w:r>
-        <w:rPr>
-          <w:sz w:val="28"/>
-        </w:rPr>
-        <w:t xml:space="preserve">рые кабинеты на этаже). Его </w:t>
+        <w:t xml:space="preserve">"». Это программное изделие предназначено для обеспечения комфортного и эффективного перемещения по нескольким неполным этажам кампуса (карта может не затрагивать некоторые кабинеты на этаже). Его </w:t>
       </w:r>
       <w:r>
         <w:rPr>
@@ -3217,13 +3106,7 @@
         <w:rPr>
           <w:sz w:val="28"/>
         </w:rPr>
-        <w:t>Целевая аудитория навигатора включает три основ</w:t>
-      </w:r>
-      <w:r>
-        <w:rPr>
-          <w:sz w:val="28"/>
-        </w:rPr>
-        <w:t>ные группы пользователей:</w:t>
+        <w:t>Целевая аудитория навигатора включает три основные группы пользователей:</w:t>
       </w:r>
     </w:p>
     <w:p>
@@ -3257,13 +3140,7 @@
         <w:rPr>
           <w:sz w:val="28"/>
         </w:rPr>
-        <w:t>преподавательский состав, который может работать в разных аудито</w:t>
-      </w:r>
-      <w:r>
-        <w:rPr>
-          <w:sz w:val="28"/>
-        </w:rPr>
-        <w:t>риях и нуждается в быстром планировании своего перемещения между занятиями;</w:t>
+        <w:t>преподавательский состав, который может работать в разных аудиториях и нуждается в быстром планировании своего перемещения между занятиями;</w:t>
       </w:r>
     </w:p>
     <w:p>
@@ -3280,13 +3157,7 @@
         <w:rPr>
           <w:sz w:val="28"/>
         </w:rPr>
-        <w:t>гости университета (абитуриенты, родители, участники конференций), для которых понятная и доступная навигация является важным элементом формирования позитивного впечатления от учеб</w:t>
-      </w:r>
-      <w:r>
-        <w:rPr>
-          <w:sz w:val="28"/>
-        </w:rPr>
-        <w:t>ного заведения.</w:t>
+        <w:t>гости университета (абитуриенты, родители, участники конференций), для которых понятная и доступная навигация является важным элементом формирования позитивного впечатления от учебного заведения.</w:t>
       </w:r>
     </w:p>
     <w:p>
@@ -3299,13 +3170,7 @@
         <w:rPr>
           <w:sz w:val="28"/>
         </w:rPr>
-        <w:t>Решение реализуется в виде адаптивного веб-приложения, что обеспечивает его кроссплатформенность и доступность без необходимости скачивания и установки дополнительного программного обеспечения. Пользователю достаточно иметь устройство (смар</w:t>
-      </w:r>
-      <w:r>
-        <w:rPr>
-          <w:sz w:val="28"/>
-        </w:rPr>
-        <w:t xml:space="preserve">тфон, планшет или ноутбук) с современным веб-браузером и доступом в локальную сеть. После ввода номеров кабинета отправления и кабинета назначения система на основе </w:t>
+        <w:t xml:space="preserve">Решение реализуется в виде адаптивного веб-приложения, что обеспечивает его кроссплатформенность и доступность без необходимости скачивания и установки дополнительного программного обеспечения. Пользователю достаточно иметь устройство (смартфон, планшет или ноутбук) с современным веб-браузером и доступом в локальную сеть. После ввода номеров кабинета отправления и кабинета назначения система на основе </w:t>
       </w:r>
       <w:proofErr w:type="spellStart"/>
       <w:r>
@@ -3319,13 +3184,7 @@
         <w:rPr>
           <w:sz w:val="28"/>
         </w:rPr>
-        <w:t xml:space="preserve"> данных о планировке здания вычисляет кратчайший путь и отображает его в инт</w:t>
-      </w:r>
-      <w:r>
-        <w:rPr>
-          <w:sz w:val="28"/>
-        </w:rPr>
-        <w:t>уитивно понятном графическом виде – SVG-файла (графического объекта), который позволит пользователю масштабировать изображение без потери качества.</w:t>
+        <w:t xml:space="preserve"> данных о планировке здания вычисляет кратчайший путь и отображает его в интуитивно понятном графическом виде – SVG-файла (графического объекта), который позволит пользователю масштабировать изображение без потери качества.</w:t>
       </w:r>
     </w:p>
     <w:p>
@@ -3338,13 +3197,7 @@
         <w:rPr>
           <w:sz w:val="28"/>
         </w:rPr>
-        <w:t>Таким образом, внедрение данного навигатора позволит не только повысить удобство для всех участников образов</w:t>
-      </w:r>
-      <w:r>
-        <w:rPr>
-          <w:sz w:val="28"/>
-        </w:rPr>
-        <w:t>ательного процесса, но и оптимизирует внутренние потоки людей, снизит нагрузку на справочные службы и повысит общий технологический имидж РТУ МИРЭА как современного, цифрового и ориентированного на комфорт своих студентов и сотрудников вуза.</w:t>
+        <w:t>Таким образом, внедрение данного навигатора позволит не только повысить удобство для всех участников образовательного процесса, но и оптимизирует внутренние потоки людей, снизит нагрузку на справочные службы и повысит общий технологический имидж РТУ МИРЭА как современного, цифрового и ориентированного на комфорт своих студентов и сотрудников вуза.</w:t>
       </w:r>
       <w:r>
         <w:br w:type="page"/>
@@ -3354,130 +3207,121 @@
       <w:pPr>
         <w:pStyle w:val="aff0"/>
       </w:pPr>
-      <w:bookmarkStart w:id="3" w:name="__RefHeading___Toc711_2206354072"/>
+      <w:bookmarkStart w:id="2" w:name="__RefHeading___Toc711_2206354072"/>
+      <w:bookmarkEnd w:id="2"/>
+      <w:r>
+        <w:lastRenderedPageBreak/>
+        <w:t>1 ОСНОВАНИЕ ДЛЯ РАЗРАБОТКИ</w:t>
+      </w:r>
+    </w:p>
+    <w:p>
+      <w:pPr>
+        <w:pStyle w:val="aff0"/>
+      </w:pPr>
+    </w:p>
+    <w:p>
+      <w:pPr>
+        <w:spacing w:line="360" w:lineRule="auto"/>
+        <w:ind w:firstLine="709"/>
+        <w:jc w:val="both"/>
+      </w:pPr>
+      <w:r>
+        <w:rPr>
+          <w:sz w:val="28"/>
+        </w:rPr>
+        <w:t>Документ, на основании которого ведется разработка: практическое задание по предмету «Введение в профессиональную деятельность».</w:t>
+      </w:r>
+    </w:p>
+    <w:p>
+      <w:pPr>
+        <w:spacing w:line="360" w:lineRule="auto"/>
+        <w:ind w:firstLine="709"/>
+        <w:jc w:val="both"/>
+      </w:pPr>
+      <w:r>
+        <w:rPr>
+          <w:sz w:val="28"/>
+        </w:rPr>
+        <w:t>Организация, утвердившая этот документ: Российский технологический университет МИРЭА.</w:t>
+      </w:r>
+    </w:p>
+    <w:p>
+      <w:pPr>
+        <w:spacing w:line="360" w:lineRule="auto"/>
+        <w:ind w:firstLine="709"/>
+        <w:jc w:val="both"/>
+      </w:pPr>
+      <w:r>
+        <w:rPr>
+          <w:sz w:val="28"/>
+        </w:rPr>
+        <w:t>Дата утверждения: _</w:t>
+      </w:r>
+      <w:proofErr w:type="gramStart"/>
+      <w:r>
+        <w:rPr>
+          <w:sz w:val="28"/>
+        </w:rPr>
+        <w:t>_._</w:t>
+      </w:r>
+      <w:proofErr w:type="gramEnd"/>
+      <w:r>
+        <w:rPr>
+          <w:sz w:val="28"/>
+        </w:rPr>
+        <w:t>_.2025</w:t>
+      </w:r>
+    </w:p>
+    <w:p>
+      <w:pPr>
+        <w:spacing w:line="360" w:lineRule="auto"/>
+        <w:ind w:firstLine="709"/>
+        <w:jc w:val="both"/>
+      </w:pPr>
+      <w:r>
+        <w:rPr>
+          <w:sz w:val="28"/>
+        </w:rPr>
+        <w:t>Наименование разработки: «Навигатор для кампуса РТУ МИРЭА "</w:t>
+      </w:r>
+      <w:proofErr w:type="spellStart"/>
+      <w:r>
+        <w:rPr>
+          <w:sz w:val="28"/>
+        </w:rPr>
+        <w:t>Путеводецъ</w:t>
+      </w:r>
+      <w:proofErr w:type="spellEnd"/>
+      <w:r>
+        <w:rPr>
+          <w:sz w:val="28"/>
+        </w:rPr>
+        <w:t xml:space="preserve"> </w:t>
+      </w:r>
+      <w:proofErr w:type="spellStart"/>
+      <w:r>
+        <w:rPr>
+          <w:sz w:val="28"/>
+        </w:rPr>
+        <w:t>Стромынька</w:t>
+      </w:r>
+      <w:proofErr w:type="spellEnd"/>
+      <w:r>
+        <w:rPr>
+          <w:sz w:val="28"/>
+        </w:rPr>
+        <w:t>"».</w:t>
+      </w:r>
+      <w:r>
+        <w:br w:type="page"/>
+      </w:r>
+    </w:p>
+    <w:p>
+      <w:pPr>
+        <w:pStyle w:val="aff0"/>
+      </w:pPr>
+      <w:bookmarkStart w:id="3" w:name="__RefHeading___Toc713_2206354072"/>
       <w:bookmarkEnd w:id="3"/>
-      <w:r>
-        <w:lastRenderedPageBreak/>
-        <w:t>1 ОСНОВАНИЕ Д</w:t>
-      </w:r>
-      <w:r>
-        <w:t>ЛЯ РАЗРАБОТКИ</w:t>
-      </w:r>
-    </w:p>
-    <w:p>
-      <w:pPr>
-        <w:pStyle w:val="aff0"/>
-      </w:pPr>
-    </w:p>
-    <w:p>
-      <w:pPr>
-        <w:spacing w:line="360" w:lineRule="auto"/>
-        <w:ind w:firstLine="709"/>
-        <w:jc w:val="both"/>
-      </w:pPr>
-      <w:r>
-        <w:rPr>
-          <w:sz w:val="28"/>
-        </w:rPr>
-        <w:t>Документ, на основании которого ведется разработка: практическое задание по предмету «Введение в профессиональную деятельность».</w:t>
-      </w:r>
-    </w:p>
-    <w:p>
-      <w:pPr>
-        <w:spacing w:line="360" w:lineRule="auto"/>
-        <w:ind w:firstLine="709"/>
-        <w:jc w:val="both"/>
-      </w:pPr>
-      <w:r>
-        <w:rPr>
-          <w:sz w:val="28"/>
-        </w:rPr>
-        <w:t>Организация, утвердившая этот документ: Российский технологический университет МИРЭА.</w:t>
-      </w:r>
-    </w:p>
-    <w:p>
-      <w:pPr>
-        <w:spacing w:line="360" w:lineRule="auto"/>
-        <w:ind w:firstLine="709"/>
-        <w:jc w:val="both"/>
-      </w:pPr>
-      <w:r>
-        <w:rPr>
-          <w:sz w:val="28"/>
-        </w:rPr>
-        <w:t>Дата утверждения: _</w:t>
-      </w:r>
-      <w:proofErr w:type="gramStart"/>
-      <w:r>
-        <w:rPr>
-          <w:sz w:val="28"/>
-        </w:rPr>
-        <w:t>_._</w:t>
-      </w:r>
-      <w:proofErr w:type="gramEnd"/>
-      <w:r>
-        <w:rPr>
-          <w:sz w:val="28"/>
-        </w:rPr>
-        <w:t>_.20</w:t>
-      </w:r>
-      <w:r>
-        <w:rPr>
-          <w:sz w:val="28"/>
-        </w:rPr>
-        <w:t>25</w:t>
-      </w:r>
-    </w:p>
-    <w:p>
-      <w:pPr>
-        <w:spacing w:line="360" w:lineRule="auto"/>
-        <w:ind w:firstLine="709"/>
-        <w:jc w:val="both"/>
-      </w:pPr>
-      <w:r>
-        <w:rPr>
-          <w:sz w:val="28"/>
-        </w:rPr>
-        <w:t>Наименование разработки: «Навигатор для кампуса РТУ МИРЭА "</w:t>
-      </w:r>
-      <w:proofErr w:type="spellStart"/>
-      <w:r>
-        <w:rPr>
-          <w:sz w:val="28"/>
-        </w:rPr>
-        <w:t>Путеводецъ</w:t>
-      </w:r>
-      <w:proofErr w:type="spellEnd"/>
-      <w:r>
-        <w:rPr>
-          <w:sz w:val="28"/>
-        </w:rPr>
-        <w:t xml:space="preserve"> </w:t>
-      </w:r>
-      <w:proofErr w:type="spellStart"/>
-      <w:r>
-        <w:rPr>
-          <w:sz w:val="28"/>
-        </w:rPr>
-        <w:t>Стромынька</w:t>
-      </w:r>
-      <w:proofErr w:type="spellEnd"/>
-      <w:r>
-        <w:rPr>
-          <w:sz w:val="28"/>
-        </w:rPr>
-        <w:t>"».</w:t>
-      </w:r>
-      <w:r>
-        <w:br w:type="page"/>
-      </w:r>
-    </w:p>
-    <w:p>
-      <w:pPr>
-        <w:pStyle w:val="aff0"/>
-      </w:pPr>
-      <w:bookmarkStart w:id="4" w:name="__RefHeading___Toc713_2206354072"/>
-      <w:bookmarkEnd w:id="4"/>
       <w:r>
         <w:lastRenderedPageBreak/>
         <w:t>2 НАЗНАЧЕНИЕ РАЗРАБОТКИ</w:t>
@@ -3498,13 +3342,7 @@
         <w:rPr>
           <w:sz w:val="28"/>
         </w:rPr>
-        <w:t>Функциональное назначение: программное изделие предназначено для автоматизированного построения и визуализации пешеходного маршрута между двумя</w:t>
-      </w:r>
-      <w:r>
-        <w:rPr>
-          <w:sz w:val="28"/>
-        </w:rPr>
-        <w:t xml:space="preserve"> точками (аудиториями) в пределах нескольких этажей здания кампуса РТУ МИРЭА на ул. Стромынка, д. 20. Визуализация осуществляется путем наложения маршрута на векторную схему (SVG) плана этажа (этажей).</w:t>
+        <w:t>Функциональное назначение: программное изделие предназначено для автоматизированного построения и визуализации пешеходного маршрута между двумя точками (аудиториями) в пределах нескольких этажей здания кампуса РТУ МИРЭА на ул. Стромынка, д. 20. Визуализация осуществляется путем наложения маршрута на векторную схему (SVG) плана этажа (этажей).</w:t>
       </w:r>
     </w:p>
     <w:p>
@@ -3517,13 +3355,7 @@
         <w:rPr>
           <w:sz w:val="28"/>
         </w:rPr>
-        <w:t>Эксплуатационное назначение: использование студентами,</w:t>
-      </w:r>
-      <w:r>
-        <w:rPr>
-          <w:sz w:val="28"/>
-        </w:rPr>
-        <w:t xml:space="preserve"> преподавательским составом, сотрудниками и гостями университета для упрощения ориентации в здании, сокращения времени на поиск аудиторий и повышения общего комфорта пребывания в кампусе. Эксплуатация осуществляется через веб-браузер.</w:t>
+        <w:t>Эксплуатационное назначение: использование студентами, преподавательским составом, сотрудниками и гостями университета для упрощения ориентации в здании, сокращения времени на поиск аудиторий и повышения общего комфорта пребывания в кампусе. Эксплуатация осуществляется через веб-браузер.</w:t>
       </w:r>
       <w:r>
         <w:br w:type="page"/>
@@ -3533,142 +3365,127 @@
       <w:pPr>
         <w:pStyle w:val="aff0"/>
       </w:pPr>
-      <w:bookmarkStart w:id="5" w:name="__RefHeading___Toc715_2206354072"/>
+      <w:bookmarkStart w:id="4" w:name="__RefHeading___Toc715_2206354072"/>
+      <w:bookmarkEnd w:id="4"/>
+      <w:r>
+        <w:lastRenderedPageBreak/>
+        <w:t>3 ТРЕБОВАНИЯ К ПРОГРАММНОМУ ИЗДЕЛИЮ</w:t>
+      </w:r>
+    </w:p>
+    <w:p>
+      <w:pPr>
+        <w:spacing w:line="360" w:lineRule="auto"/>
+        <w:ind w:firstLine="709"/>
+        <w:jc w:val="both"/>
+      </w:pPr>
+    </w:p>
+    <w:p>
+      <w:pPr>
+        <w:pStyle w:val="aff1"/>
+      </w:pPr>
+      <w:bookmarkStart w:id="5" w:name="__RefHeading___Toc636_2790114037"/>
       <w:bookmarkEnd w:id="5"/>
       <w:r>
-        <w:lastRenderedPageBreak/>
-        <w:t>3 ТРЕБОВАНИЯ К ПРОГР</w:t>
-      </w:r>
-      <w:r>
-        <w:t>АММНОМУ ИЗДЕЛИЮ</w:t>
-      </w:r>
+        <w:t>3.1 Область применения программного обеспечения</w:t>
+      </w:r>
+    </w:p>
+    <w:p>
+      <w:pPr>
+        <w:pStyle w:val="aff1"/>
+      </w:pPr>
     </w:p>
     <w:p>
       <w:pPr>
         <w:spacing w:line="360" w:lineRule="auto"/>
         <w:ind w:firstLine="709"/>
         <w:jc w:val="both"/>
+        <w:rPr>
+          <w:sz w:val="28"/>
+        </w:rPr>
+      </w:pPr>
+      <w:r>
+        <w:rPr>
+          <w:sz w:val="28"/>
+        </w:rPr>
+        <w:t>Настоящий документ определяет требования к программному обеспечению «Навигатор для кампуса РТУ МИРЭА "</w:t>
+      </w:r>
+      <w:proofErr w:type="spellStart"/>
+      <w:r>
+        <w:rPr>
+          <w:sz w:val="28"/>
+        </w:rPr>
+        <w:t>Путеводецъ</w:t>
+      </w:r>
+      <w:proofErr w:type="spellEnd"/>
+      <w:r>
+        <w:rPr>
+          <w:sz w:val="28"/>
+        </w:rPr>
+        <w:t xml:space="preserve"> </w:t>
+      </w:r>
+      <w:proofErr w:type="spellStart"/>
+      <w:r>
+        <w:rPr>
+          <w:sz w:val="28"/>
+        </w:rPr>
+        <w:t>Стромынька</w:t>
+      </w:r>
+      <w:proofErr w:type="spellEnd"/>
+      <w:r>
+        <w:rPr>
+          <w:sz w:val="28"/>
+        </w:rPr>
+        <w:t>"» для расчета и визуализации оптимальных маршрутов между кабинетами кампуса.</w:t>
+      </w:r>
+    </w:p>
+    <w:p>
+      <w:pPr>
+        <w:spacing w:line="360" w:lineRule="auto"/>
+        <w:ind w:firstLine="709"/>
+        <w:jc w:val="both"/>
+        <w:rPr>
+          <w:sz w:val="28"/>
+        </w:rPr>
+      </w:pPr>
+      <w:r>
+        <w:rPr>
+          <w:sz w:val="28"/>
+        </w:rPr>
+        <w:t>Программное обеспечение предназначено для облегчения навигации по зданию студентами, преподавателями и посетителями.</w:t>
+      </w:r>
+    </w:p>
+    <w:p>
+      <w:pPr>
+        <w:spacing w:line="360" w:lineRule="auto"/>
+        <w:ind w:firstLine="709"/>
+        <w:jc w:val="both"/>
+        <w:rPr>
+          <w:sz w:val="28"/>
+        </w:rPr>
+      </w:pPr>
+      <w:r>
+        <w:rPr>
+          <w:sz w:val="28"/>
+        </w:rPr>
+        <w:t>Программное обеспечение реализует навигацию по 2 и 3 этажам корпуса на ул. Стромынка, д. 20, с возможностью дальнейшего расширения на дополнительные уровни.</w:t>
+      </w:r>
+    </w:p>
+    <w:p>
+      <w:pPr>
+        <w:spacing w:line="360" w:lineRule="auto"/>
+        <w:ind w:firstLine="709"/>
+        <w:jc w:val="both"/>
+        <w:rPr>
+          <w:sz w:val="28"/>
+        </w:rPr>
       </w:pPr>
     </w:p>
     <w:p>
       <w:pPr>
         <w:pStyle w:val="aff1"/>
       </w:pPr>
-      <w:bookmarkStart w:id="6" w:name="__RefHeading___Toc636_2790114037"/>
+      <w:bookmarkStart w:id="6" w:name="__RefHeading___Toc775_2206354072"/>
       <w:bookmarkEnd w:id="6"/>
-      <w:r>
-        <w:t>3.1 Область применения программного обеспечения</w:t>
-      </w:r>
-    </w:p>
-    <w:p>
-      <w:pPr>
-        <w:pStyle w:val="aff1"/>
-      </w:pPr>
-    </w:p>
-    <w:p>
-      <w:pPr>
-        <w:spacing w:line="360" w:lineRule="auto"/>
-        <w:ind w:firstLine="709"/>
-        <w:jc w:val="both"/>
-        <w:rPr>
-          <w:sz w:val="28"/>
-        </w:rPr>
-      </w:pPr>
-      <w:r>
-        <w:rPr>
-          <w:sz w:val="28"/>
-        </w:rPr>
-        <w:t>Настоящий документ определяет требования к программному обеспечению «Навигатор для кампуса РТУ МИРЭА "</w:t>
-      </w:r>
-      <w:proofErr w:type="spellStart"/>
-      <w:r>
-        <w:rPr>
-          <w:sz w:val="28"/>
-        </w:rPr>
-        <w:t>Путеводецъ</w:t>
-      </w:r>
-      <w:proofErr w:type="spellEnd"/>
-      <w:r>
-        <w:rPr>
-          <w:sz w:val="28"/>
-        </w:rPr>
-        <w:t xml:space="preserve"> </w:t>
-      </w:r>
-      <w:proofErr w:type="spellStart"/>
-      <w:r>
-        <w:rPr>
-          <w:sz w:val="28"/>
-        </w:rPr>
-        <w:t>Стромынька</w:t>
-      </w:r>
-      <w:proofErr w:type="spellEnd"/>
-      <w:r>
-        <w:rPr>
-          <w:sz w:val="28"/>
-        </w:rPr>
-        <w:t xml:space="preserve">"» для расчета и визуализации оптимальных маршрутов между </w:t>
-      </w:r>
-      <w:r>
-        <w:rPr>
-          <w:sz w:val="28"/>
-        </w:rPr>
-        <w:t>кабинетами кампуса.</w:t>
-      </w:r>
-    </w:p>
-    <w:p>
-      <w:pPr>
-        <w:spacing w:line="360" w:lineRule="auto"/>
-        <w:ind w:firstLine="709"/>
-        <w:jc w:val="both"/>
-        <w:rPr>
-          <w:sz w:val="28"/>
-        </w:rPr>
-      </w:pPr>
-      <w:r>
-        <w:rPr>
-          <w:sz w:val="28"/>
-        </w:rPr>
-        <w:t>Программное обеспечение предназначено для облегчения навигации по зданию студентами, преподавателями и посетителями.</w:t>
-      </w:r>
-    </w:p>
-    <w:p>
-      <w:pPr>
-        <w:spacing w:line="360" w:lineRule="auto"/>
-        <w:ind w:firstLine="709"/>
-        <w:jc w:val="both"/>
-        <w:rPr>
-          <w:sz w:val="28"/>
-        </w:rPr>
-      </w:pPr>
-      <w:r>
-        <w:rPr>
-          <w:sz w:val="28"/>
-        </w:rPr>
-        <w:t>Программное обеспечение реализует навигацию по 2 и 3 этажам корпуса на ул. Стромынка, д. 20, с возможностью дальнейшего</w:t>
-      </w:r>
-      <w:r>
-        <w:rPr>
-          <w:sz w:val="28"/>
-        </w:rPr>
-        <w:t xml:space="preserve"> расширения на дополнительные уровни.</w:t>
-      </w:r>
-    </w:p>
-    <w:p>
-      <w:pPr>
-        <w:spacing w:line="360" w:lineRule="auto"/>
-        <w:ind w:firstLine="709"/>
-        <w:jc w:val="both"/>
-        <w:rPr>
-          <w:sz w:val="28"/>
-        </w:rPr>
-      </w:pPr>
-    </w:p>
-    <w:p>
-      <w:pPr>
-        <w:pStyle w:val="aff1"/>
-      </w:pPr>
-      <w:bookmarkStart w:id="7" w:name="__RefHeading___Toc775_2206354072"/>
-      <w:bookmarkEnd w:id="7"/>
       <w:r>
         <w:t>3.2 Требования к функциональным характеристикам</w:t>
       </w:r>
@@ -3784,13 +3601,7 @@
         <w:rPr>
           <w:sz w:val="28"/>
         </w:rPr>
-        <w:t>визуализация результата, то ес</w:t>
-      </w:r>
-      <w:r>
-        <w:rPr>
-          <w:sz w:val="28"/>
-        </w:rPr>
-        <w:t>ть отображение схемы этажа (этажей) с графически выделенным маршрутом (линия);</w:t>
+        <w:t>визуализация результата, то есть отображение схемы этажа (этажей) с графически выделенным маршрутом (линия);</w:t>
       </w:r>
     </w:p>
     <w:p>
@@ -3827,13 +3638,7 @@
         <w:rPr>
           <w:sz w:val="28"/>
         </w:rPr>
-        <w:t>отображение вспомогательной информации (номера кабинетов, лестницы, входы/выходы)</w:t>
-      </w:r>
-      <w:r>
-        <w:rPr>
-          <w:sz w:val="28"/>
-        </w:rPr>
-        <w:t>.</w:t>
+        <w:t>отображение вспомогательной информации (номера кабинетов, лестницы, входы/выходы).</w:t>
       </w:r>
     </w:p>
     <w:p>
@@ -3944,13 +3749,7 @@
         <w:rPr>
           <w:sz w:val="28"/>
         </w:rPr>
-        <w:t>Входн</w:t>
-      </w:r>
-      <w:r>
-        <w:rPr>
-          <w:sz w:val="28"/>
-        </w:rPr>
-        <w:t>ые данные представляют собой строковые идентификаторы помещений старта и финиша. Выходные данные — это графический файл в формате SVG в Base64, содержит план этажа (этажей) с помещениями, выделенный маршрут, маркеры переходов (если они есть).</w:t>
+        <w:t>Входные данные представляют собой строковые идентификаторы помещений старта и финиша. Выходные данные — это графический файл в формате SVG в Base64, содержит план этажа (этажей) с помещениями, выделенный маршрут, маркеры переходов (если они есть).</w:t>
       </w:r>
     </w:p>
     <w:p>
@@ -3963,13 +3762,7 @@
         <w:rPr>
           <w:sz w:val="28"/>
         </w:rPr>
-        <w:t xml:space="preserve">Пользователю </w:t>
-      </w:r>
-      <w:r>
-        <w:rPr>
-          <w:sz w:val="28"/>
-        </w:rPr>
-        <w:t xml:space="preserve">необходимо заполнить оба поля для построения </w:t>
+        <w:t xml:space="preserve">Пользователю необходимо заполнить оба поля для построения </w:t>
       </w:r>
       <w:r>
         <w:rPr>
@@ -3983,13 +3776,7 @@
           <w:sz w:val="28"/>
         </w:rPr>
         <w:br/>
-        <w:t>должны совпадать. На локальном сервере происходит повторная проверка формата введенных кабинетов и существования их в базе, после чего осуществля</w:t>
-      </w:r>
-      <w:r>
-        <w:rPr>
-          <w:sz w:val="28"/>
-        </w:rPr>
-        <w:t>ется проверка возможности построения маршрута и возврат соответствующего HTTP кода.</w:t>
+        <w:t>должны совпадать. На локальном сервере происходит повторная проверка формата введенных кабинетов и существования их в базе, после чего осуществляется проверка возможности построения маршрута и возврат соответствующего HTTP кода.</w:t>
       </w:r>
     </w:p>
     <w:p>
@@ -4046,14 +3833,7 @@
           <w:sz w:val="28"/>
           <w:szCs w:val="28"/>
         </w:rPr>
-        <w:t xml:space="preserve"> представляют </w:t>
-      </w:r>
-      <w:r>
-        <w:rPr>
-          <w:sz w:val="28"/>
-          <w:szCs w:val="28"/>
-        </w:rPr>
-        <w:t>собой пересечения;</w:t>
+        <w:t xml:space="preserve"> представляют собой пересечения;</w:t>
       </w:r>
     </w:p>
     <w:p>
@@ -4214,14 +3994,7 @@
           <w:sz w:val="28"/>
           <w:szCs w:val="28"/>
         </w:rPr>
-        <w:t xml:space="preserve"> соединяют узлы коридора смежных эт</w:t>
-      </w:r>
-      <w:r>
-        <w:rPr>
-          <w:sz w:val="28"/>
-          <w:szCs w:val="28"/>
-        </w:rPr>
-        <w:t>ажей.</w:t>
+        <w:t xml:space="preserve"> соединяют узлы коридора смежных этажей.</w:t>
       </w:r>
     </w:p>
     <w:p>
@@ -4305,13 +4078,7 @@
           <w:sz w:val="28"/>
         </w:rPr>
         <w:lastRenderedPageBreak/>
-        <w:t>условная единица. Результатом является</w:t>
-      </w:r>
-      <w:r>
-        <w:rPr>
-          <w:sz w:val="28"/>
-        </w:rPr>
-        <w:t xml:space="preserve"> массив вершин маршрута в порядке прохождения.</w:t>
+        <w:t>условная единица. Результатом является массив вершин маршрута в порядке прохождения.</w:t>
       </w:r>
     </w:p>
     <w:p>
@@ -4334,13 +4101,7 @@
           <w:sz w:val="28"/>
         </w:rPr>
         <w:br/>
-        <w:t>этаже включено 100 кабинетов, 2 туалета, 5 лестниц и 72 узла коридора, на третьем — 6 кабинетов, 1 лестница и 4 узла коридора. Всего в графе</w:t>
-      </w:r>
-      <w:r>
-        <w:rPr>
-          <w:sz w:val="28"/>
-        </w:rPr>
-        <w:t xml:space="preserve"> используется 190 вершин.</w:t>
+        <w:t>этаже включено 100 кабинетов, 2 туалета, 5 лестниц и 72 узла коридора, на третьем — 6 кабинетов, 1 лестница и 4 узла коридора. Всего в графе используется 190 вершин.</w:t>
       </w:r>
     </w:p>
     <w:p>
@@ -4360,13 +4121,7 @@
           <w:sz w:val="28"/>
         </w:rPr>
         <w:br/>
-        <w:t xml:space="preserve">графическом виде. При построении маршрута на одном этаже отображается план этажа с кабинетами и коридорами, найденный маршрут выделяется красной линией, маркируется стартовое и </w:t>
-      </w:r>
-      <w:r>
-        <w:rPr>
-          <w:sz w:val="28"/>
-        </w:rPr>
-        <w:t>конечное помещение.</w:t>
+        <w:t>графическом виде. При построении маршрута на одном этаже отображается план этажа с кабинетами и коридорами, найденный маршрут выделяется красной линией, маркируется стартовое и конечное помещение.</w:t>
       </w:r>
       <w:r>
         <w:rPr>
@@ -4387,13 +4142,7 @@
           <w:sz w:val="28"/>
         </w:rPr>
         <w:br/>
-        <w:t xml:space="preserve">(значки лестниц), найденный маршрут выделяется красной линией, дополнительно выводится надпись-подсказка </w:t>
-      </w:r>
-      <w:r>
-        <w:rPr>
-          <w:sz w:val="28"/>
-        </w:rPr>
-        <w:t>«Переход по лестнице между 2 и 3 этажами».</w:t>
+        <w:t>(значки лестниц), найденный маршрут выделяется красной линией, дополнительно выводится надпись-подсказка «Переход по лестнице между 2 и 3 этажами».</w:t>
       </w:r>
     </w:p>
     <w:p>
@@ -4406,13 +4155,7 @@
         <w:rPr>
           <w:sz w:val="28"/>
         </w:rPr>
-        <w:t xml:space="preserve">Время отклика системы, то есть время от момента отправки запроса до отображения маршрута, не должно превышать 10 секунд при стандартной нагрузке. Программа обеспечивает быстрое построение маршрутов в соответствии </w:t>
-      </w:r>
-      <w:r>
-        <w:rPr>
-          <w:sz w:val="28"/>
-        </w:rPr>
-        <w:t>с заданным требованием по времени отклика и гарантирует корректную работу в условиях сетевой среды.</w:t>
+        <w:t>Время отклика системы, то есть время от момента отправки запроса до отображения маршрута, не должно превышать 10 секунд при стандартной нагрузке. Программа обеспечивает быстрое построение маршрутов в соответствии с заданным требованием по времени отклика и гарантирует корректную работу в условиях сетевой среды.</w:t>
       </w:r>
     </w:p>
     <w:p>
@@ -4425,13 +4168,7 @@
         <w:rPr>
           <w:sz w:val="28"/>
         </w:rPr>
-        <w:t>Работа веб-приложения адаптирована под разные устройства (то есть может осуществляться на персональных компьютерах, планшетах, мобильных телефонах) с наличи</w:t>
-      </w:r>
-      <w:r>
-        <w:rPr>
-          <w:sz w:val="28"/>
-        </w:rPr>
-        <w:t>ем веб-браузера.</w:t>
+        <w:t>Работа веб-приложения адаптирована под разные устройства (то есть может осуществляться на персональных компьютерах, планшетах, мобильных телефонах) с наличием веб-браузера.</w:t>
       </w:r>
     </w:p>
     <w:p>
@@ -4445,74 +4182,66 @@
       <w:pPr>
         <w:pStyle w:val="aff1"/>
       </w:pPr>
-      <w:bookmarkStart w:id="8" w:name="__RefHeading___Toc777_2206354072"/>
+      <w:bookmarkStart w:id="7" w:name="__RefHeading___Toc777_2206354072"/>
+      <w:bookmarkEnd w:id="7"/>
+      <w:r>
+        <w:t>3.3 Условия эксплуатации</w:t>
+      </w:r>
+    </w:p>
+    <w:p>
+      <w:pPr>
+        <w:pStyle w:val="aff1"/>
+      </w:pPr>
+    </w:p>
+    <w:p>
+      <w:pPr>
+        <w:pStyle w:val="a4"/>
+        <w:spacing w:line="360" w:lineRule="auto"/>
+        <w:ind w:firstLine="709"/>
+        <w:jc w:val="both"/>
+        <w:rPr>
+          <w:b w:val="0"/>
+          <w:color w:val="000000"/>
+          <w:szCs w:val="28"/>
+        </w:rPr>
+      </w:pPr>
+      <w:r>
+        <w:rPr>
+          <w:b w:val="0"/>
+          <w:color w:val="000000"/>
+          <w:szCs w:val="28"/>
+        </w:rPr>
+        <w:t xml:space="preserve">Обслуживание не требует специального персонала. Обновление базы данных кабинетов и схем этажей осуществляется администратором системы. Для эксплуатации веб-приложения квалификация пользователя не требуется. </w:t>
+      </w:r>
+      <w:r>
+        <w:rPr>
+          <w:b w:val="0"/>
+          <w:color w:val="000000"/>
+          <w:szCs w:val="28"/>
+        </w:rPr>
+        <w:lastRenderedPageBreak/>
+        <w:t>Для администрирования системы необходим специалист с базовыми знаниями в области веб-технологий.</w:t>
+      </w:r>
+    </w:p>
+    <w:p>
+      <w:pPr>
+        <w:pStyle w:val="a4"/>
+        <w:spacing w:line="360" w:lineRule="auto"/>
+        <w:ind w:firstLine="709"/>
+        <w:jc w:val="both"/>
+        <w:rPr>
+          <w:b w:val="0"/>
+          <w:color w:val="000000"/>
+          <w:szCs w:val="28"/>
+        </w:rPr>
+      </w:pPr>
+    </w:p>
+    <w:p>
+      <w:pPr>
+        <w:pStyle w:val="aff1"/>
+      </w:pPr>
+      <w:bookmarkStart w:id="8" w:name="__RefHeading___Toc779_2206354072"/>
       <w:bookmarkEnd w:id="8"/>
-      <w:r>
-        <w:t>3.3 Условия эксплуатации</w:t>
-      </w:r>
-    </w:p>
-    <w:p>
-      <w:pPr>
-        <w:pStyle w:val="aff1"/>
-      </w:pPr>
-    </w:p>
-    <w:p>
-      <w:pPr>
-        <w:pStyle w:val="a4"/>
-        <w:spacing w:line="360" w:lineRule="auto"/>
-        <w:ind w:firstLine="709"/>
-        <w:jc w:val="both"/>
-        <w:rPr>
-          <w:b w:val="0"/>
-          <w:color w:val="000000"/>
-          <w:szCs w:val="28"/>
-        </w:rPr>
-      </w:pPr>
-      <w:r>
-        <w:rPr>
-          <w:b w:val="0"/>
-          <w:color w:val="000000"/>
-          <w:szCs w:val="28"/>
-        </w:rPr>
-        <w:t xml:space="preserve">Обслуживание не требует специального персонала. Обновление базы данных кабинетов и схем этажей осуществляется администратором системы. Для эксплуатации веб-приложения квалификация пользователя не требуется. </w:t>
-      </w:r>
-      <w:r>
-        <w:rPr>
-          <w:b w:val="0"/>
-          <w:color w:val="000000"/>
-          <w:szCs w:val="28"/>
-        </w:rPr>
-        <w:lastRenderedPageBreak/>
-        <w:t>Для а</w:t>
-      </w:r>
-      <w:r>
-        <w:rPr>
-          <w:b w:val="0"/>
-          <w:color w:val="000000"/>
-          <w:szCs w:val="28"/>
-        </w:rPr>
-        <w:t>дминистрирования системы необходим специалист с базовыми знаниями в области веб-технологий.</w:t>
-      </w:r>
-    </w:p>
-    <w:p>
-      <w:pPr>
-        <w:pStyle w:val="a4"/>
-        <w:spacing w:line="360" w:lineRule="auto"/>
-        <w:ind w:firstLine="709"/>
-        <w:jc w:val="both"/>
-        <w:rPr>
-          <w:b w:val="0"/>
-          <w:color w:val="000000"/>
-          <w:szCs w:val="28"/>
-        </w:rPr>
-      </w:pPr>
-    </w:p>
-    <w:p>
-      <w:pPr>
-        <w:pStyle w:val="aff1"/>
-      </w:pPr>
-      <w:bookmarkStart w:id="9" w:name="__RefHeading___Toc779_2206354072"/>
-      <w:bookmarkEnd w:id="9"/>
       <w:r>
         <w:t>3.4 Требования к составу и параметрам технических средств</w:t>
       </w:r>
@@ -4587,15 +4316,7 @@
           <w:sz w:val="28"/>
           <w:szCs w:val="28"/>
         </w:rPr>
-        <w:t>ОЗУ размером</w:t>
-      </w:r>
-      <w:r>
-        <w:rPr>
-          <w:color w:val="000000"/>
-          <w:sz w:val="28"/>
-          <w:szCs w:val="28"/>
-        </w:rPr>
-        <w:t xml:space="preserve"> 2 Гб;</w:t>
+        <w:t>ОЗУ размером 2 Гб;</w:t>
       </w:r>
     </w:p>
     <w:p>
@@ -4843,8 +4564,8 @@
       <w:pPr>
         <w:pStyle w:val="aff1"/>
       </w:pPr>
-      <w:bookmarkStart w:id="10" w:name="__RefHeading___Toc781_2206354072"/>
-      <w:bookmarkEnd w:id="10"/>
+      <w:bookmarkStart w:id="9" w:name="__RefHeading___Toc781_2206354072"/>
+      <w:bookmarkEnd w:id="9"/>
       <w:r>
         <w:t>3.5 Требования к информационной и программной совместимости</w:t>
       </w:r>
@@ -5578,14 +5299,7 @@
                 <w:sz w:val="28"/>
                 <w:szCs w:val="28"/>
               </w:rPr>
-              <w:t>К</w:t>
-            </w:r>
-            <w:r>
-              <w:rPr>
-                <w:sz w:val="28"/>
-                <w:szCs w:val="28"/>
-              </w:rPr>
-              <w:t>омпонент</w:t>
+              <w:t>Компонент</w:t>
             </w:r>
           </w:p>
         </w:tc>
@@ -6270,14 +5984,7 @@
           <w:sz w:val="28"/>
           <w:szCs w:val="28"/>
         </w:rPr>
-        <w:t xml:space="preserve">SVG — векторная графика для визуализации </w:t>
-      </w:r>
-      <w:r>
-        <w:rPr>
-          <w:sz w:val="28"/>
-          <w:szCs w:val="28"/>
-        </w:rPr>
-        <w:t>маршрутов;</w:t>
+        <w:t>SVG — векторная графика для визуализации маршрутов;</w:t>
       </w:r>
     </w:p>
     <w:p>
@@ -6395,15 +6102,7 @@
           <w:sz w:val="28"/>
           <w:szCs w:val="28"/>
         </w:rPr>
-        <w:t>возможность интеграции с други</w:t>
-      </w:r>
-      <w:r>
-        <w:rPr>
-          <w:color w:val="000000"/>
-          <w:sz w:val="28"/>
-          <w:szCs w:val="28"/>
-        </w:rPr>
-        <w:t>ми системами РТУ МИРЭА через REST API.</w:t>
+        <w:t>возможность интеграции с другими системами РТУ МИРЭА через REST API.</w:t>
       </w:r>
     </w:p>
     <w:p>
@@ -6420,8 +6119,8 @@
       <w:pPr>
         <w:pStyle w:val="aff1"/>
       </w:pPr>
-      <w:bookmarkStart w:id="11" w:name="__RefHeading___Toc783_2206354072"/>
-      <w:bookmarkEnd w:id="11"/>
+      <w:bookmarkStart w:id="10" w:name="__RefHeading___Toc783_2206354072"/>
+      <w:bookmarkEnd w:id="10"/>
       <w:r>
         <w:t>3.6 Требования к маркировке и упаковке</w:t>
       </w:r>
@@ -6565,14 +6264,7 @@
           <w:color w:val="000000"/>
           <w:sz w:val="28"/>
         </w:rPr>
-        <w:t xml:space="preserve">Требования к </w:t>
-      </w:r>
-      <w:r>
-        <w:rPr>
-          <w:color w:val="000000"/>
-          <w:sz w:val="28"/>
-        </w:rPr>
-        <w:t>упаковке включают:</w:t>
+        <w:t>Требования к упаковке включают:</w:t>
       </w:r>
     </w:p>
     <w:p>
@@ -6612,14 +6304,7 @@
           <w:color w:val="000000"/>
           <w:sz w:val="28"/>
         </w:rPr>
-        <w:t>упаковка должна гарантировать сохранность физического носителя при транспортировке и хранении в течение у</w:t>
-      </w:r>
-      <w:r>
-        <w:rPr>
-          <w:color w:val="000000"/>
-          <w:sz w:val="28"/>
-        </w:rPr>
-        <w:t>казанного срока.</w:t>
+        <w:t>упаковка должна гарантировать сохранность физического носителя при транспортировке и хранении в течение указанного срока.</w:t>
       </w:r>
     </w:p>
     <w:p>
@@ -6635,8 +6320,8 @@
       <w:pPr>
         <w:pStyle w:val="aff1"/>
       </w:pPr>
-      <w:bookmarkStart w:id="12" w:name="__RefHeading___Toc785_2206354072"/>
-      <w:bookmarkEnd w:id="12"/>
+      <w:bookmarkStart w:id="11" w:name="__RefHeading___Toc785_2206354072"/>
+      <w:bookmarkEnd w:id="11"/>
       <w:r>
         <w:t>3.7 Требования к транспортировке и хранению</w:t>
       </w:r>
@@ -6661,14 +6346,7 @@
           <w:color w:val="000000"/>
           <w:sz w:val="28"/>
         </w:rPr>
-        <w:t>Транспортирование требует исключения воздействия на упаковку с физическим носителем прямых солнечных лучей и источников тепла, повышенной влажности, сильных магнитных полей, сильных механически</w:t>
-      </w:r>
-      <w:r>
-        <w:rPr>
-          <w:color w:val="000000"/>
-          <w:sz w:val="28"/>
-        </w:rPr>
-        <w:t>х воздействий.</w:t>
+        <w:t>Транспортирование требует исключения воздействия на упаковку с физическим носителем прямых солнечных лучей и источников тепла, повышенной влажности, сильных магнитных полей, сильных механических воздействий.</w:t>
       </w:r>
     </w:p>
     <w:p>
@@ -6744,14 +6422,7 @@
           <w:color w:val="000000"/>
           <w:sz w:val="28"/>
         </w:rPr>
-        <w:t xml:space="preserve">исключение воздействия пыли и прямого </w:t>
-      </w:r>
-      <w:r>
-        <w:rPr>
-          <w:color w:val="000000"/>
-          <w:sz w:val="28"/>
-        </w:rPr>
-        <w:t>солнечного излучения.</w:t>
+        <w:t>исключение воздействия пыли и прямого солнечного излучения.</w:t>
       </w:r>
     </w:p>
     <w:p>
@@ -6768,8 +6439,8 @@
       <w:pPr>
         <w:pStyle w:val="aff1"/>
       </w:pPr>
-      <w:bookmarkStart w:id="13" w:name="__RefHeading___Toc672_1138778423"/>
-      <w:bookmarkEnd w:id="13"/>
+      <w:bookmarkStart w:id="12" w:name="__RefHeading___Toc672_1138778423"/>
+      <w:bookmarkEnd w:id="12"/>
       <w:r>
         <w:t>3.8 Специальные требования</w:t>
       </w:r>
@@ -6871,15 +6542,7 @@
           <w:sz w:val="28"/>
           <w:szCs w:val="28"/>
         </w:rPr>
-        <w:t xml:space="preserve">возможность расширения функционала программного </w:t>
-      </w:r>
-      <w:r>
-        <w:rPr>
-          <w:color w:val="000000"/>
-          <w:sz w:val="28"/>
-          <w:szCs w:val="28"/>
-        </w:rPr>
-        <w:t>обеспечения;</w:t>
+        <w:t>возможность расширения функционала программного обеспечения;</w:t>
       </w:r>
     </w:p>
     <w:p>
@@ -6912,8 +6575,8 @@
       <w:pPr>
         <w:pStyle w:val="aff0"/>
       </w:pPr>
-      <w:bookmarkStart w:id="14" w:name="__RefHeading___Toc717_2206354072"/>
-      <w:bookmarkEnd w:id="14"/>
+      <w:bookmarkStart w:id="13" w:name="__RefHeading___Toc717_2206354072"/>
+      <w:bookmarkEnd w:id="13"/>
       <w:r>
         <w:lastRenderedPageBreak/>
         <w:t>4 ТРЕБОВАНИЯ К ПРОГРАММНОЙ ДОКУМЕНТАЦИИ</w:t>
@@ -7017,14 +6680,11 @@
       <w:pPr>
         <w:pStyle w:val="aff0"/>
       </w:pPr>
-      <w:bookmarkStart w:id="15" w:name="__RefHeading___Toc719_2206354072"/>
-      <w:bookmarkEnd w:id="15"/>
+      <w:bookmarkStart w:id="14" w:name="__RefHeading___Toc719_2206354072"/>
+      <w:bookmarkEnd w:id="14"/>
       <w:r>
         <w:lastRenderedPageBreak/>
-        <w:t>5 СТАДИИ И ЭТАПЫ РАЗРАБ</w:t>
-      </w:r>
-      <w:r>
-        <w:t>ОТКИ</w:t>
+        <w:t>5 СТАДИИ И ЭТАПЫ РАЗРАБОТКИ</w:t>
       </w:r>
     </w:p>
     <w:p>
@@ -7113,13 +6773,7 @@
         <w:rPr>
           <w:sz w:val="28"/>
         </w:rPr>
-        <w:t>тестирование программного обеспечен</w:t>
-      </w:r>
-      <w:r>
-        <w:rPr>
-          <w:sz w:val="28"/>
-        </w:rPr>
-        <w:t>ия;</w:t>
+        <w:t>тестирование программного обеспечения;</w:t>
       </w:r>
     </w:p>
     <w:p>
@@ -7529,8 +7183,8 @@
       <w:pPr>
         <w:pStyle w:val="aff0"/>
       </w:pPr>
-      <w:bookmarkStart w:id="16" w:name="__RefHeading___Toc913_2225854529"/>
-      <w:bookmarkEnd w:id="16"/>
+      <w:bookmarkStart w:id="15" w:name="__RefHeading___Toc913_2225854529"/>
+      <w:bookmarkEnd w:id="15"/>
       <w:r>
         <w:lastRenderedPageBreak/>
         <w:t>6 ЭКСПЛУАТАЦИОННАЯ ДОКУМЕНТАЦИЯ</w:t>
@@ -7551,19 +7205,13 @@
       <w:pPr>
         <w:pStyle w:val="aff1"/>
       </w:pPr>
-      <w:bookmarkStart w:id="17" w:name="__RefHeading___Toc915_2225854529"/>
-      <w:bookmarkEnd w:id="17"/>
-      <w:r>
-        <w:rPr>
-          <w:szCs w:val="28"/>
-        </w:rPr>
-        <w:t xml:space="preserve">6.1 Описание </w:t>
-      </w:r>
-      <w:r>
-        <w:rPr>
-          <w:szCs w:val="28"/>
-        </w:rPr>
-        <w:t>окружения и среды развертывания</w:t>
+      <w:bookmarkStart w:id="16" w:name="__RefHeading___Toc915_2225854529"/>
+      <w:bookmarkEnd w:id="16"/>
+      <w:r>
+        <w:rPr>
+          <w:szCs w:val="28"/>
+        </w:rPr>
+        <w:t>6.1 Описание окружения и среды развертывания</w:t>
       </w:r>
     </w:p>
     <w:p>
@@ -7866,17 +7514,7 @@
           <w:shd w:val="clear" w:color="auto" w:fill="FFFFFF"/>
           <w:lang w:val="en-US"/>
         </w:rPr>
-        <w:t xml:space="preserve"> 3.1+, Matplotlib 3.7.1+, Pillow </w:t>
-      </w:r>
-      <w:r>
-        <w:rPr>
-          <w:color w:val="000000"/>
-          <w:sz w:val="28"/>
-          <w:szCs w:val="28"/>
-          <w:shd w:val="clear" w:color="auto" w:fill="FFFFFF"/>
-          <w:lang w:val="en-US"/>
-        </w:rPr>
-        <w:t>10.0.0+;</w:t>
+        <w:t xml:space="preserve"> 3.1+, Matplotlib 3.7.1+, Pillow 10.0.0+;</w:t>
       </w:r>
     </w:p>
     <w:p>
@@ -8045,8 +7683,8 @@
       <w:pPr>
         <w:pStyle w:val="aff1"/>
       </w:pPr>
-      <w:bookmarkStart w:id="18" w:name="__RefHeading___Toc917_2225854529"/>
-      <w:bookmarkEnd w:id="18"/>
+      <w:bookmarkStart w:id="17" w:name="__RefHeading___Toc917_2225854529"/>
+      <w:bookmarkEnd w:id="17"/>
       <w:r>
         <w:rPr>
           <w:rFonts w:eastAsia="Georgia"/>
@@ -8173,17 +7811,7 @@
           <w:szCs w:val="28"/>
           <w:shd w:val="clear" w:color="auto" w:fill="FFFFFF"/>
         </w:rPr>
-        <w:t xml:space="preserve"> </w:t>
-      </w:r>
-      <w:r>
-        <w:rPr>
-          <w:rFonts w:eastAsia="Georgia"/>
-          <w:color w:val="000000"/>
-          <w:sz w:val="28"/>
-          <w:szCs w:val="28"/>
-          <w:shd w:val="clear" w:color="auto" w:fill="FFFFFF"/>
-        </w:rPr>
-        <w:t>(</w:t>
+        <w:t xml:space="preserve"> (</w:t>
       </w:r>
       <w:proofErr w:type="spellStart"/>
       <w:r>
@@ -8447,16 +8075,7 @@
           <w:szCs w:val="28"/>
           <w:shd w:val="clear" w:color="auto" w:fill="FFFFFF"/>
         </w:rPr>
-        <w:t>получение исходного</w:t>
-      </w:r>
-      <w:r>
-        <w:rPr>
-          <w:color w:val="000000"/>
-          <w:sz w:val="28"/>
-          <w:szCs w:val="28"/>
-          <w:shd w:val="clear" w:color="auto" w:fill="FFFFFF"/>
-        </w:rPr>
-        <w:t xml:space="preserve"> кода: </w:t>
+        <w:t xml:space="preserve">получение исходного кода: </w:t>
       </w:r>
       <w:r>
         <w:rPr>
@@ -8582,6 +8201,206 @@
     </w:p>
     <w:p>
       <w:pPr>
+        <w:spacing w:line="360" w:lineRule="auto"/>
+        <w:ind w:left="720"/>
+        <w:jc w:val="both"/>
+        <w:rPr>
+          <w:color w:val="000000"/>
+          <w:sz w:val="28"/>
+          <w:szCs w:val="28"/>
+          <w:shd w:val="clear" w:color="auto" w:fill="FFFFFF"/>
+        </w:rPr>
+      </w:pPr>
+      <w:r>
+        <w:rPr>
+          <w:szCs w:val="28"/>
+        </w:rPr>
+        <w:t xml:space="preserve">- </w:t>
+      </w:r>
+      <w:r>
+        <w:rPr>
+          <w:color w:val="000000"/>
+          <w:sz w:val="28"/>
+          <w:szCs w:val="28"/>
+          <w:shd w:val="clear" w:color="auto" w:fill="FFFFFF"/>
+        </w:rPr>
+        <w:t xml:space="preserve">создание виртуального окружения: выполните команду </w:t>
+      </w:r>
+      <w:proofErr w:type="spellStart"/>
+      <w:r>
+        <w:rPr>
+          <w:color w:val="000000"/>
+          <w:sz w:val="28"/>
+          <w:szCs w:val="28"/>
+          <w:shd w:val="clear" w:color="auto" w:fill="FFFFFF"/>
+        </w:rPr>
+        <w:t>py</w:t>
+      </w:r>
+      <w:proofErr w:type="spellEnd"/>
+      <w:r>
+        <w:rPr>
+          <w:color w:val="000000"/>
+          <w:sz w:val="28"/>
+          <w:szCs w:val="28"/>
+          <w:shd w:val="clear" w:color="auto" w:fill="FFFFFF"/>
+        </w:rPr>
+        <w:t xml:space="preserve"> -m </w:t>
+      </w:r>
+      <w:proofErr w:type="spellStart"/>
+      <w:r>
+        <w:rPr>
+          <w:color w:val="000000"/>
+          <w:sz w:val="28"/>
+          <w:szCs w:val="28"/>
+          <w:shd w:val="clear" w:color="auto" w:fill="FFFFFF"/>
+        </w:rPr>
+        <w:t>venv</w:t>
+      </w:r>
+      <w:proofErr w:type="spellEnd"/>
+      <w:r>
+        <w:rPr>
+          <w:color w:val="000000"/>
+          <w:sz w:val="28"/>
+          <w:szCs w:val="28"/>
+          <w:shd w:val="clear" w:color="auto" w:fill="FFFFFF"/>
+        </w:rPr>
+        <w:t xml:space="preserve"> </w:t>
+      </w:r>
+      <w:proofErr w:type="spellStart"/>
+      <w:r>
+        <w:rPr>
+          <w:color w:val="000000"/>
+          <w:sz w:val="28"/>
+          <w:szCs w:val="28"/>
+          <w:shd w:val="clear" w:color="auto" w:fill="FFFFFF"/>
+        </w:rPr>
+        <w:t>venv</w:t>
+      </w:r>
+      <w:proofErr w:type="spellEnd"/>
+      <w:r>
+        <w:rPr>
+          <w:color w:val="000000"/>
+          <w:sz w:val="28"/>
+          <w:szCs w:val="28"/>
+          <w:shd w:val="clear" w:color="auto" w:fill="FFFFFF"/>
+        </w:rPr>
+        <w:t xml:space="preserve"> (windows) или </w:t>
+      </w:r>
+      <w:r>
+        <w:rPr>
+          <w:color w:val="000000"/>
+          <w:sz w:val="28"/>
+          <w:szCs w:val="28"/>
+          <w:shd w:val="clear" w:color="auto" w:fill="FFFFFF"/>
+        </w:rPr>
+        <w:t xml:space="preserve">python3 -m </w:t>
+      </w:r>
+      <w:proofErr w:type="spellStart"/>
+      <w:r>
+        <w:rPr>
+          <w:color w:val="000000"/>
+          <w:sz w:val="28"/>
+          <w:szCs w:val="28"/>
+          <w:shd w:val="clear" w:color="auto" w:fill="FFFFFF"/>
+        </w:rPr>
+        <w:t>venv</w:t>
+      </w:r>
+      <w:proofErr w:type="spellEnd"/>
+      <w:r>
+        <w:rPr>
+          <w:color w:val="000000"/>
+          <w:sz w:val="28"/>
+          <w:szCs w:val="28"/>
+          <w:shd w:val="clear" w:color="auto" w:fill="FFFFFF"/>
+        </w:rPr>
+        <w:t xml:space="preserve"> </w:t>
+      </w:r>
+      <w:proofErr w:type="spellStart"/>
+      <w:r>
+        <w:rPr>
+          <w:color w:val="000000"/>
+          <w:sz w:val="28"/>
+          <w:szCs w:val="28"/>
+          <w:shd w:val="clear" w:color="auto" w:fill="FFFFFF"/>
+        </w:rPr>
+        <w:t>venv</w:t>
+      </w:r>
+      <w:proofErr w:type="spellEnd"/>
+      <w:r>
+        <w:rPr>
+          <w:color w:val="000000"/>
+          <w:sz w:val="28"/>
+          <w:szCs w:val="28"/>
+          <w:shd w:val="clear" w:color="auto" w:fill="FFFFFF"/>
+        </w:rPr>
+        <w:t xml:space="preserve"> (macOS/Linux);</w:t>
+      </w:r>
+    </w:p>
+    <w:p>
+      <w:pPr>
+        <w:spacing w:line="360" w:lineRule="auto"/>
+        <w:ind w:left="720"/>
+        <w:jc w:val="both"/>
+        <w:rPr>
+          <w:rFonts w:eastAsia="Georgia"/>
+          <w:color w:val="000000"/>
+          <w:sz w:val="28"/>
+          <w:szCs w:val="28"/>
+          <w:shd w:val="clear" w:color="auto" w:fill="FFFFFF"/>
+        </w:rPr>
+      </w:pPr>
+      <w:r>
+        <w:rPr>
+          <w:szCs w:val="28"/>
+          <w:lang w:val="en-US"/>
+        </w:rPr>
+        <w:t xml:space="preserve">- </w:t>
+      </w:r>
+      <w:r>
+        <w:rPr>
+          <w:rFonts w:eastAsia="Georgia"/>
+          <w:color w:val="000000"/>
+          <w:sz w:val="28"/>
+          <w:szCs w:val="28"/>
+          <w:shd w:val="clear" w:color="auto" w:fill="FFFFFF"/>
+        </w:rPr>
+        <w:t xml:space="preserve">активация: </w:t>
+      </w:r>
+      <w:r>
+        <w:rPr>
+          <w:rFonts w:eastAsia="Georgia"/>
+          <w:color w:val="000000"/>
+          <w:sz w:val="28"/>
+          <w:szCs w:val="28"/>
+          <w:shd w:val="clear" w:color="auto" w:fill="FFFFFF"/>
+        </w:rPr>
+        <w:t>выполните команду venv\Scripts\activate</w:t>
+      </w:r>
+      <w:r>
+        <w:rPr>
+          <w:rFonts w:eastAsia="Georgia"/>
+          <w:color w:val="000000"/>
+          <w:sz w:val="28"/>
+          <w:szCs w:val="28"/>
+          <w:shd w:val="clear" w:color="auto" w:fill="FFFFFF"/>
+        </w:rPr>
+        <w:t xml:space="preserve"> </w:t>
+      </w:r>
+      <w:r>
+        <w:rPr>
+          <w:rFonts w:eastAsia="Georgia"/>
+          <w:color w:val="000000"/>
+          <w:sz w:val="28"/>
+          <w:szCs w:val="28"/>
+          <w:shd w:val="clear" w:color="auto" w:fill="FFFFFF"/>
+        </w:rPr>
+        <w:t>(windows) или source venv/bin/activate (macOS/Linux);</w:t>
+      </w:r>
+      <w:bookmarkStart w:id="18" w:name="_GoBack"/>
+      <w:bookmarkEnd w:id="18"/>
+    </w:p>
+    <w:p>
+      <w:pPr>
         <w:numPr>
           <w:ilvl w:val="0"/>
           <w:numId w:val="13"/>
@@ -8597,7 +8416,34 @@
           <w:szCs w:val="28"/>
           <w:shd w:val="clear" w:color="auto" w:fill="FFFFFF"/>
         </w:rPr>
-        <w:t xml:space="preserve">установка зависимостей: </w:t>
+        <w:t>установка</w:t>
+      </w:r>
+      <w:r>
+        <w:rPr>
+          <w:color w:val="000000"/>
+          <w:sz w:val="28"/>
+          <w:szCs w:val="28"/>
+          <w:shd w:val="clear" w:color="auto" w:fill="FFFFFF"/>
+        </w:rPr>
+        <w:t xml:space="preserve"> </w:t>
+      </w:r>
+      <w:r>
+        <w:rPr>
+          <w:color w:val="000000"/>
+          <w:sz w:val="28"/>
+          <w:szCs w:val="28"/>
+          <w:shd w:val="clear" w:color="auto" w:fill="FFFFFF"/>
+        </w:rPr>
+        <w:t>зависимостей</w:t>
+      </w:r>
+      <w:r>
+        <w:rPr>
+          <w:color w:val="000000"/>
+          <w:sz w:val="28"/>
+          <w:szCs w:val="28"/>
+          <w:shd w:val="clear" w:color="auto" w:fill="FFFFFF"/>
+        </w:rPr>
+        <w:t xml:space="preserve">: </w:t>
       </w:r>
       <w:r>
         <w:rPr>
@@ -8607,7 +8453,217 @@
           <w:szCs w:val="28"/>
           <w:shd w:val="clear" w:color="auto" w:fill="FFFFFF"/>
         </w:rPr>
-        <w:t xml:space="preserve">в командной строке/терминале перейдите в папку проекта и выполните команду </w:t>
+        <w:t>в</w:t>
+      </w:r>
+      <w:r>
+        <w:rPr>
+          <w:rFonts w:eastAsia="Georgia"/>
+          <w:color w:val="000000"/>
+          <w:sz w:val="28"/>
+          <w:szCs w:val="28"/>
+          <w:shd w:val="clear" w:color="auto" w:fill="FFFFFF"/>
+        </w:rPr>
+        <w:t xml:space="preserve"> </w:t>
+      </w:r>
+      <w:r>
+        <w:rPr>
+          <w:rFonts w:eastAsia="Georgia"/>
+          <w:color w:val="000000"/>
+          <w:sz w:val="28"/>
+          <w:szCs w:val="28"/>
+          <w:shd w:val="clear" w:color="auto" w:fill="FFFFFF"/>
+        </w:rPr>
+        <w:t>командной</w:t>
+      </w:r>
+      <w:r>
+        <w:rPr>
+          <w:rFonts w:eastAsia="Georgia"/>
+          <w:color w:val="000000"/>
+          <w:sz w:val="28"/>
+          <w:szCs w:val="28"/>
+          <w:shd w:val="clear" w:color="auto" w:fill="FFFFFF"/>
+        </w:rPr>
+        <w:t xml:space="preserve"> </w:t>
+      </w:r>
+      <w:r>
+        <w:rPr>
+          <w:rFonts w:eastAsia="Georgia"/>
+          <w:color w:val="000000"/>
+          <w:sz w:val="28"/>
+          <w:szCs w:val="28"/>
+          <w:shd w:val="clear" w:color="auto" w:fill="FFFFFF"/>
+        </w:rPr>
+        <w:t>строке</w:t>
+      </w:r>
+      <w:r>
+        <w:rPr>
+          <w:rFonts w:eastAsia="Georgia"/>
+          <w:color w:val="000000"/>
+          <w:sz w:val="28"/>
+          <w:szCs w:val="28"/>
+          <w:shd w:val="clear" w:color="auto" w:fill="FFFFFF"/>
+        </w:rPr>
+        <w:t>/</w:t>
+      </w:r>
+      <w:r>
+        <w:rPr>
+          <w:rFonts w:eastAsia="Georgia"/>
+          <w:color w:val="000000"/>
+          <w:sz w:val="28"/>
+          <w:szCs w:val="28"/>
+          <w:shd w:val="clear" w:color="auto" w:fill="FFFFFF"/>
+        </w:rPr>
+        <w:t>терминале</w:t>
+      </w:r>
+      <w:r>
+        <w:rPr>
+          <w:rFonts w:eastAsia="Georgia"/>
+          <w:color w:val="000000"/>
+          <w:sz w:val="28"/>
+          <w:szCs w:val="28"/>
+          <w:shd w:val="clear" w:color="auto" w:fill="FFFFFF"/>
+        </w:rPr>
+        <w:t xml:space="preserve"> </w:t>
+      </w:r>
+      <w:r>
+        <w:rPr>
+          <w:rFonts w:eastAsia="Georgia"/>
+          <w:color w:val="000000"/>
+          <w:sz w:val="28"/>
+          <w:szCs w:val="28"/>
+          <w:shd w:val="clear" w:color="auto" w:fill="FFFFFF"/>
+        </w:rPr>
+        <w:t>перейдите</w:t>
+      </w:r>
+      <w:r>
+        <w:rPr>
+          <w:rFonts w:eastAsia="Georgia"/>
+          <w:color w:val="000000"/>
+          <w:sz w:val="28"/>
+          <w:szCs w:val="28"/>
+          <w:shd w:val="clear" w:color="auto" w:fill="FFFFFF"/>
+        </w:rPr>
+        <w:t xml:space="preserve"> </w:t>
+      </w:r>
+      <w:r>
+        <w:rPr>
+          <w:rFonts w:eastAsia="Georgia"/>
+          <w:color w:val="000000"/>
+          <w:sz w:val="28"/>
+          <w:szCs w:val="28"/>
+          <w:shd w:val="clear" w:color="auto" w:fill="FFFFFF"/>
+        </w:rPr>
+        <w:t>в</w:t>
+      </w:r>
+      <w:r>
+        <w:rPr>
+          <w:rFonts w:eastAsia="Georgia"/>
+          <w:color w:val="000000"/>
+          <w:sz w:val="28"/>
+          <w:szCs w:val="28"/>
+          <w:shd w:val="clear" w:color="auto" w:fill="FFFFFF"/>
+        </w:rPr>
+        <w:t xml:space="preserve"> </w:t>
+      </w:r>
+      <w:r>
+        <w:rPr>
+          <w:rFonts w:eastAsia="Georgia"/>
+          <w:color w:val="000000"/>
+          <w:sz w:val="28"/>
+          <w:szCs w:val="28"/>
+          <w:shd w:val="clear" w:color="auto" w:fill="FFFFFF"/>
+        </w:rPr>
+        <w:t>папку</w:t>
+      </w:r>
+      <w:r>
+        <w:rPr>
+          <w:rFonts w:eastAsia="Georgia"/>
+          <w:color w:val="000000"/>
+          <w:sz w:val="28"/>
+          <w:szCs w:val="28"/>
+          <w:shd w:val="clear" w:color="auto" w:fill="FFFFFF"/>
+        </w:rPr>
+        <w:t xml:space="preserve"> </w:t>
+      </w:r>
+      <w:r>
+        <w:rPr>
+          <w:rFonts w:eastAsia="Georgia"/>
+          <w:color w:val="000000"/>
+          <w:sz w:val="28"/>
+          <w:szCs w:val="28"/>
+          <w:shd w:val="clear" w:color="auto" w:fill="FFFFFF"/>
+        </w:rPr>
+        <w:t>проекта</w:t>
+      </w:r>
+      <w:r>
+        <w:rPr>
+          <w:rFonts w:eastAsia="Georgia"/>
+          <w:color w:val="000000"/>
+          <w:sz w:val="28"/>
+          <w:szCs w:val="28"/>
+          <w:shd w:val="clear" w:color="auto" w:fill="FFFFFF"/>
+        </w:rPr>
+        <w:t xml:space="preserve"> </w:t>
+      </w:r>
+      <w:r>
+        <w:rPr>
+          <w:rFonts w:eastAsia="Georgia"/>
+          <w:color w:val="000000"/>
+          <w:sz w:val="28"/>
+          <w:szCs w:val="28"/>
+          <w:shd w:val="clear" w:color="auto" w:fill="FFFFFF"/>
+        </w:rPr>
+        <w:t>и</w:t>
+      </w:r>
+      <w:r>
+        <w:rPr>
+          <w:rFonts w:eastAsia="Georgia"/>
+          <w:color w:val="000000"/>
+          <w:sz w:val="28"/>
+          <w:szCs w:val="28"/>
+          <w:shd w:val="clear" w:color="auto" w:fill="FFFFFF"/>
+        </w:rPr>
+        <w:t xml:space="preserve"> </w:t>
+      </w:r>
+      <w:r>
+        <w:rPr>
+          <w:rFonts w:eastAsia="Georgia"/>
+          <w:color w:val="000000"/>
+          <w:sz w:val="28"/>
+          <w:szCs w:val="28"/>
+          <w:shd w:val="clear" w:color="auto" w:fill="FFFFFF"/>
+        </w:rPr>
+        <w:t>выполните</w:t>
+      </w:r>
+      <w:r>
+        <w:rPr>
+          <w:rFonts w:eastAsia="Georgia"/>
+          <w:color w:val="000000"/>
+          <w:sz w:val="28"/>
+          <w:szCs w:val="28"/>
+          <w:shd w:val="clear" w:color="auto" w:fill="FFFFFF"/>
+        </w:rPr>
+        <w:t xml:space="preserve"> </w:t>
+      </w:r>
+      <w:r>
+        <w:rPr>
+          <w:rFonts w:eastAsia="Georgia"/>
+          <w:color w:val="000000"/>
+          <w:sz w:val="28"/>
+          <w:szCs w:val="28"/>
+          <w:shd w:val="clear" w:color="auto" w:fill="FFFFFF"/>
+        </w:rPr>
+        <w:t>команду</w:t>
+      </w:r>
+      <w:r>
+        <w:rPr>
+          <w:rFonts w:eastAsia="Georgia"/>
+          <w:color w:val="000000"/>
+          <w:sz w:val="28"/>
+          <w:szCs w:val="28"/>
+          <w:shd w:val="clear" w:color="auto" w:fill="FFFFFF"/>
+        </w:rPr>
+        <w:t xml:space="preserve"> </w:t>
       </w:r>
       <w:proofErr w:type="spellStart"/>
       <w:r>
@@ -8706,17 +8762,16 @@
         </w:rPr>
         <w:t xml:space="preserve"> </w:t>
       </w:r>
-      <w:proofErr w:type="spellStart"/>
-      <w:r>
-        <w:rPr>
-          <w:color w:val="000000"/>
-          <w:sz w:val="28"/>
-          <w:szCs w:val="28"/>
-          <w:shd w:val="clear" w:color="auto" w:fill="FFFFFF"/>
+      <w:r>
+        <w:rPr>
+          <w:color w:val="000000"/>
+          <w:sz w:val="28"/>
+          <w:szCs w:val="28"/>
+          <w:shd w:val="clear" w:color="auto" w:fill="FFFFFF"/>
+          <w:lang w:val="en-US"/>
         </w:rPr>
         <w:t>requirements</w:t>
       </w:r>
-      <w:proofErr w:type="spellEnd"/>
       <w:r>
         <w:rPr>
           <w:color w:val="000000"/>
@@ -8781,7 +8836,25 @@
           <w:szCs w:val="28"/>
           <w:shd w:val="clear" w:color="auto" w:fill="FFFFFF"/>
         </w:rPr>
-        <w:t xml:space="preserve">) или </w:t>
+        <w:t xml:space="preserve">) </w:t>
+      </w:r>
+      <w:r>
+        <w:rPr>
+          <w:color w:val="000000"/>
+          <w:sz w:val="28"/>
+          <w:szCs w:val="28"/>
+          <w:shd w:val="clear" w:color="auto" w:fill="FFFFFF"/>
+        </w:rPr>
+        <w:t>или</w:t>
+      </w:r>
+      <w:r>
+        <w:rPr>
+          <w:color w:val="000000"/>
+          <w:sz w:val="28"/>
+          <w:szCs w:val="28"/>
+          <w:shd w:val="clear" w:color="auto" w:fill="FFFFFF"/>
+        </w:rPr>
+        <w:t xml:space="preserve"> </w:t>
       </w:r>
       <w:r>
         <w:rPr>
@@ -8878,17 +8951,16 @@
         </w:rPr>
         <w:t xml:space="preserve"> </w:t>
       </w:r>
-      <w:proofErr w:type="spellStart"/>
-      <w:r>
-        <w:rPr>
-          <w:color w:val="000000"/>
-          <w:sz w:val="28"/>
-          <w:szCs w:val="28"/>
-          <w:shd w:val="clear" w:color="auto" w:fill="FFFFFF"/>
+      <w:r>
+        <w:rPr>
+          <w:color w:val="000000"/>
+          <w:sz w:val="28"/>
+          <w:szCs w:val="28"/>
+          <w:shd w:val="clear" w:color="auto" w:fill="FFFFFF"/>
+          <w:lang w:val="en-US"/>
         </w:rPr>
         <w:t>requirements</w:t>
       </w:r>
-      <w:proofErr w:type="spellEnd"/>
       <w:r>
         <w:rPr>
           <w:color w:val="000000"/>
@@ -8982,17 +9054,7 @@
           <w:szCs w:val="28"/>
           <w:shd w:val="clear" w:color="auto" w:fill="FFFFFF"/>
         </w:rPr>
-        <w:t>Система установит в</w:t>
-      </w:r>
-      <w:r>
-        <w:rPr>
-          <w:rFonts w:eastAsia="Georgia"/>
-          <w:color w:val="000000"/>
-          <w:sz w:val="28"/>
-          <w:szCs w:val="28"/>
-          <w:shd w:val="clear" w:color="auto" w:fill="FFFFFF"/>
-        </w:rPr>
-        <w:t xml:space="preserve">се необходимые пакеты: </w:t>
+        <w:t xml:space="preserve">Система установит все необходимые пакеты: </w:t>
       </w:r>
       <w:proofErr w:type="spellStart"/>
       <w:r>
@@ -9384,6 +9446,16 @@
           <w:lang w:val="en-US"/>
         </w:rPr>
         <w:br/>
+      </w:r>
+      <w:r>
+        <w:rPr>
+          <w:color w:val="000000"/>
+          <w:sz w:val="28"/>
+          <w:szCs w:val="28"/>
+          <w:shd w:val="clear" w:color="auto" w:fill="FFFFFF"/>
+          <w:lang w:val="en-US"/>
+        </w:rPr>
+        <w:lastRenderedPageBreak/>
         <w:t xml:space="preserve">production. Running on http://0.0.0.0:8001. Press CTRL+C to quit". </w:t>
       </w:r>
       <w:r>
@@ -9393,16 +9465,7 @@
           <w:szCs w:val="28"/>
           <w:shd w:val="clear" w:color="auto" w:fill="FFFFFF"/>
         </w:rPr>
-        <w:t xml:space="preserve">После этого приложение будет доступно по адресу </w:t>
-      </w:r>
-      <w:r>
-        <w:rPr>
-          <w:color w:val="000000"/>
-          <w:sz w:val="28"/>
-          <w:szCs w:val="28"/>
-          <w:shd w:val="clear" w:color="auto" w:fill="FFFFFF"/>
-        </w:rPr>
-        <w:t>http://localhost:8001 или http://&lt;IP_сервера&gt;:8001, где &lt;</w:t>
+        <w:t>После этого приложение будет доступно по адресу http://localhost:8001 или http://&lt;IP_сервера&gt;:8001, где &lt;</w:t>
       </w:r>
       <w:proofErr w:type="spellStart"/>
       <w:r>
@@ -9438,7 +9501,6 @@
           <w:szCs w:val="28"/>
           <w:shd w:val="clear" w:color="auto" w:fill="FFFFFF"/>
         </w:rPr>
-        <w:lastRenderedPageBreak/>
         <w:t>Для остановки сервера нажмите CTRL+C в командной строке/терминале.</w:t>
       </w:r>
     </w:p>
@@ -9455,16 +9517,7 @@
           <w:szCs w:val="28"/>
           <w:shd w:val="clear" w:color="auto" w:fill="FFFFFF"/>
         </w:rPr>
-        <w:t>При необходимости можно изменить порт, отредактировав строку в файле</w:t>
-      </w:r>
-      <w:r>
-        <w:rPr>
-          <w:color w:val="000000"/>
-          <w:sz w:val="28"/>
-          <w:szCs w:val="28"/>
-          <w:shd w:val="clear" w:color="auto" w:fill="FFFFFF"/>
-        </w:rPr>
-        <w:t> </w:t>
+        <w:t>При необходимости можно изменить порт, отредактировав строку в файле </w:t>
       </w:r>
       <w:r>
         <w:rPr>
@@ -9741,16 +9794,7 @@
           <w:szCs w:val="28"/>
           <w:shd w:val="clear" w:color="auto" w:fill="FFFFFF"/>
         </w:rPr>
-        <w:t>, но следует учитывать, что</w:t>
-      </w:r>
-      <w:r>
-        <w:rPr>
-          <w:color w:val="000000"/>
-          <w:sz w:val="28"/>
-          <w:szCs w:val="28"/>
-          <w:shd w:val="clear" w:color="auto" w:fill="FFFFFF"/>
-        </w:rPr>
-        <w:t xml:space="preserve"> это может привести к снижению производительности приложения, поэтому данный режим рекомендуется использовать только при разработке.</w:t>
+        <w:t>, но следует учитывать, что это может привести к снижению производительности приложения, поэтому данный режим рекомендуется использовать только при разработке.</w:t>
       </w:r>
     </w:p>
     <w:p>
@@ -9829,16 +9873,7 @@
           <w:szCs w:val="28"/>
           <w:shd w:val="clear" w:color="auto" w:fill="FFFFFF"/>
         </w:rPr>
-        <w:t>пользователь: в веб-браузере вводит н</w:t>
-      </w:r>
-      <w:r>
-        <w:rPr>
-          <w:color w:val="000000"/>
-          <w:sz w:val="28"/>
-          <w:szCs w:val="28"/>
-          <w:shd w:val="clear" w:color="auto" w:fill="FFFFFF"/>
-        </w:rPr>
-        <w:t>омера исходного и целевого помещений в полях ввода на странице приложения;</w:t>
+        <w:t>пользователь: в веб-браузере вводит номера исходного и целевого помещений в полях ввода на странице приложения;</w:t>
       </w:r>
     </w:p>
     <w:p>
@@ -9909,16 +9944,7 @@
           <w:szCs w:val="28"/>
           <w:shd w:val="clear" w:color="auto" w:fill="FFFFFF"/>
         </w:rPr>
-        <w:t>при успешной проверке клиентская часть формирует HTTP-запрос метода POST по а</w:t>
-      </w:r>
-      <w:r>
-        <w:rPr>
-          <w:color w:val="000000"/>
-          <w:sz w:val="28"/>
-          <w:szCs w:val="28"/>
-          <w:shd w:val="clear" w:color="auto" w:fill="FFFFFF"/>
-        </w:rPr>
-        <w:t>дресу /</w:t>
+        <w:t>при успешной проверке клиентская часть формирует HTTP-запрос метода POST по адресу /</w:t>
       </w:r>
       <w:proofErr w:type="spellStart"/>
       <w:r>
@@ -10069,16 +10095,7 @@
           <w:szCs w:val="28"/>
           <w:shd w:val="clear" w:color="auto" w:fill="FFFFFF"/>
         </w:rPr>
-        <w:t>navigate.py: проверяет наличие указанных помещений в графе, выполн</w:t>
-      </w:r>
-      <w:r>
-        <w:rPr>
-          <w:color w:val="000000"/>
-          <w:sz w:val="28"/>
-          <w:szCs w:val="28"/>
-          <w:shd w:val="clear" w:color="auto" w:fill="FFFFFF"/>
-        </w:rPr>
-        <w:t xml:space="preserve">яет поиск кратчайшего маршрута (алгоритм </w:t>
+        <w:t xml:space="preserve">navigate.py: проверяет наличие указанных помещений в графе, выполняет поиск кратчайшего маршрута (алгоритм </w:t>
       </w:r>
       <w:proofErr w:type="spellStart"/>
       <w:r>
@@ -10098,16 +10115,17 @@
           <w:szCs w:val="28"/>
           <w:shd w:val="clear" w:color="auto" w:fill="FFFFFF"/>
         </w:rPr>
-        <w:t xml:space="preserve">/BFS), определяет этажи и формирует маршрут, выполняет построение графического изображения маршрута на плане этажа(ей) с помощью библиотеки визуализации, формирует изображение в формате SVG и кодирует его в </w:t>
-      </w:r>
-      <w:r>
-        <w:rPr>
-          <w:color w:val="000000"/>
-          <w:sz w:val="28"/>
-          <w:szCs w:val="28"/>
-          <w:shd w:val="clear" w:color="auto" w:fill="FFFFFF"/>
-        </w:rPr>
-        <w:t>строку Base64;</w:t>
+        <w:t xml:space="preserve">/BFS), определяет этажи и формирует маршрут, выполняет построение графического изображения </w:t>
+      </w:r>
+      <w:r>
+        <w:rPr>
+          <w:color w:val="000000"/>
+          <w:sz w:val="28"/>
+          <w:szCs w:val="28"/>
+          <w:shd w:val="clear" w:color="auto" w:fill="FFFFFF"/>
+        </w:rPr>
+        <w:lastRenderedPageBreak/>
+        <w:t>маршрута на плане этажа(ей) с помощью библиотеки визуализации, формирует изображение в формате SVG и кодирует его в строку Base64;</w:t>
       </w:r>
     </w:p>
     <w:p>
@@ -10148,7 +10166,6 @@
           <w:szCs w:val="28"/>
           <w:shd w:val="clear" w:color="auto" w:fill="FFFFFF"/>
         </w:rPr>
-        <w:lastRenderedPageBreak/>
         <w:t>frontend</w:t>
       </w:r>
       <w:proofErr w:type="spellEnd"/>
@@ -10159,16 +10176,7 @@
           <w:szCs w:val="28"/>
           <w:shd w:val="clear" w:color="auto" w:fill="FFFFFF"/>
         </w:rPr>
-        <w:t>: получает ответ, разбирает JSON, декодирует строку SVG и отображает резуль</w:t>
-      </w:r>
-      <w:r>
-        <w:rPr>
-          <w:color w:val="000000"/>
-          <w:sz w:val="28"/>
-          <w:szCs w:val="28"/>
-          <w:shd w:val="clear" w:color="auto" w:fill="FFFFFF"/>
-        </w:rPr>
-        <w:t>тат (карту с маршрутом) в окне браузера;</w:t>
+        <w:t>: получает ответ, разбирает JSON, декодирует строку SVG и отображает результат (карту с маршрутом) в окне браузера;</w:t>
       </w:r>
     </w:p>
     <w:p>
@@ -10247,36 +10255,16 @@
           <w:szCs w:val="28"/>
           <w:shd w:val="clear" w:color="auto" w:fill="FFFFFF"/>
         </w:rPr>
-        <w:t>http://localhost:800</w:t>
-      </w:r>
-      <w:r>
-        <w:rPr>
-          <w:rStyle w:val="af5"/>
-          <w:rFonts w:ascii="Times New Roman" w:hAnsi="Times New Roman" w:cs="Times New Roman"/>
-          <w:color w:val="000000"/>
-          <w:sz w:val="28"/>
-          <w:szCs w:val="28"/>
-          <w:shd w:val="clear" w:color="auto" w:fill="FFFFFF"/>
-        </w:rPr>
-        <w:t>1</w:t>
-      </w:r>
-      <w:r>
-        <w:rPr>
-          <w:color w:val="000000"/>
-          <w:sz w:val="28"/>
-          <w:szCs w:val="28"/>
-          <w:shd w:val="clear" w:color="auto" w:fill="FFFFFF"/>
-        </w:rPr>
-        <w:t> (или IP сервера). На странице вы увидите форму с полями "От кабинета" и "До кабинета". Выберите исходное и целевое помещения и нажмите кнопку «Построить маршрут». Результат отобразится в виде карты этажей с нарисованным маршрутом (красная линия), а также</w:t>
-      </w:r>
-      <w:r>
-        <w:rPr>
-          <w:color w:val="000000"/>
-          <w:sz w:val="28"/>
-          <w:szCs w:val="28"/>
-          <w:shd w:val="clear" w:color="auto" w:fill="FFFFFF"/>
-        </w:rPr>
-        <w:t xml:space="preserve"> текстовой информацией, если есть переход между этажами.</w:t>
+        <w:t>http://localhost:8001</w:t>
+      </w:r>
+      <w:r>
+        <w:rPr>
+          <w:color w:val="000000"/>
+          <w:sz w:val="28"/>
+          <w:szCs w:val="28"/>
+          <w:shd w:val="clear" w:color="auto" w:fill="FFFFFF"/>
+        </w:rPr>
+        <w:t> (или IP сервера). На странице вы увидите форму с полями "От кабинета" и "До кабинета". Выберите исходное и целевое помещения и нажмите кнопку «Построить маршрут». Результат отобразится в виде карты этажей с нарисованным маршрутом (красная линия), а также текстовой информацией, если есть переход между этажами.</w:t>
       </w:r>
     </w:p>
     <w:p>
@@ -10292,16 +10280,7 @@
           <w:szCs w:val="28"/>
           <w:shd w:val="clear" w:color="auto" w:fill="FFFFFF"/>
         </w:rPr>
-        <w:t>На втором этаже доступны кабинеты 3-14, 17, 18, 20, 200, 202-218, 218а, 219, 220, 220а, 220б, 220в, 221, 222, 222а, 223, 224, 224а, 225-237, 239а, 239б, 241, 241л, 242, 244, 245а, 245б, 246, 248-251,</w:t>
-      </w:r>
-      <w:r>
-        <w:rPr>
-          <w:color w:val="000000"/>
-          <w:sz w:val="28"/>
-          <w:szCs w:val="28"/>
-          <w:shd w:val="clear" w:color="auto" w:fill="FFFFFF"/>
-        </w:rPr>
-        <w:t xml:space="preserve"> 251а, 251б, 251-254, 256, 257, 258а, 259-266, 266а, 266б, 267, 269, 271, 273, 275, 279, 279а, 279б, 281, 283, 285, а также туалеты (</w:t>
+        <w:t>На втором этаже доступны кабинеты 3-14, 17, 18, 20, 200, 202-218, 218а, 219, 220, 220а, 220б, 220в, 221, 222, 222а, 223, 224, 224а, 225-237, 239а, 239б, 241, 241л, 242, 244, 245а, 245б, 246, 248-251, 251а, 251б, 251-254, 256, 257, 258а, 259-266, 266а, 266б, 267, 269, 271, 273, 275, 279, 279а, 279б, 281, 283, 285, а также туалеты (</w:t>
       </w:r>
       <w:proofErr w:type="spellStart"/>
       <w:r>
@@ -10357,16 +10336,7 @@
           <w:szCs w:val="28"/>
           <w:shd w:val="clear" w:color="auto" w:fill="FFFFFF"/>
         </w:rPr>
-        <w:t>При возникнове</w:t>
-      </w:r>
-      <w:r>
-        <w:rPr>
-          <w:color w:val="000000"/>
-          <w:sz w:val="28"/>
-          <w:szCs w:val="28"/>
-          <w:shd w:val="clear" w:color="auto" w:fill="FFFFFF"/>
-        </w:rPr>
-        <w:t xml:space="preserve">нии ошибок система выведет соответствующее сообщение. Возможные ошибки, их причины и решение отображены в </w:t>
+        <w:t xml:space="preserve">При возникновении ошибок система выведет соответствующее сообщение. Возможные ошибки, их причины и решение отображены в </w:t>
       </w:r>
       <w:r>
         <w:rPr>
@@ -10576,14 +10546,7 @@
                 <w:sz w:val="28"/>
                 <w:szCs w:val="28"/>
               </w:rPr>
-              <w:t>Проверьте</w:t>
-            </w:r>
-            <w:r>
-              <w:rPr>
-                <w:sz w:val="28"/>
-                <w:szCs w:val="28"/>
-              </w:rPr>
-              <w:t xml:space="preserve"> номер в списке доступных кабинетов, проверьте введенную букву</w:t>
+              <w:t>Проверьте номер в списке доступных кабинетов, проверьте введенную букву</w:t>
             </w:r>
           </w:p>
         </w:tc>
@@ -10739,14 +10702,7 @@
                 <w:sz w:val="28"/>
                 <w:szCs w:val="28"/>
               </w:rPr>
-              <w:t xml:space="preserve">Убедитесь в корректности номеров, </w:t>
-            </w:r>
-            <w:r>
-              <w:rPr>
-                <w:sz w:val="28"/>
-                <w:szCs w:val="28"/>
-              </w:rPr>
-              <w:t>перезапустите сервер</w:t>
+              <w:t>Убедитесь в корректности номеров, перезапустите сервер</w:t>
             </w:r>
           </w:p>
         </w:tc>
@@ -10899,14 +10855,7 @@
                 <w:sz w:val="28"/>
                 <w:szCs w:val="28"/>
               </w:rPr>
-              <w:t>Сервер медленно ра</w:t>
-            </w:r>
-            <w:r>
-              <w:rPr>
-                <w:sz w:val="28"/>
-                <w:szCs w:val="28"/>
-              </w:rPr>
-              <w:t>ботает</w:t>
+              <w:t>Сервер медленно работает</w:t>
             </w:r>
           </w:p>
         </w:tc>
@@ -11097,16 +11046,7 @@
           <w:szCs w:val="28"/>
           <w:shd w:val="clear" w:color="auto" w:fill="FFFFFF"/>
         </w:rPr>
-        <w:t>Fla</w:t>
-      </w:r>
-      <w:r>
-        <w:rPr>
-          <w:color w:val="000000"/>
-          <w:sz w:val="28"/>
-          <w:szCs w:val="28"/>
-          <w:shd w:val="clear" w:color="auto" w:fill="FFFFFF"/>
-        </w:rPr>
-        <w:t>sk</w:t>
+        <w:t>Flask</w:t>
       </w:r>
       <w:proofErr w:type="spellEnd"/>
       <w:r>
@@ -11132,16 +11072,7 @@
           <w:szCs w:val="28"/>
           <w:shd w:val="clear" w:color="auto" w:fill="FFFFFF"/>
         </w:rPr>
-        <w:t xml:space="preserve">Обслуживание включает регулярное резервное копирование исходного кода и конфигурации, а также обновление зависимостей. Критически </w:t>
-      </w:r>
-      <w:r>
-        <w:rPr>
-          <w:color w:val="000000"/>
-          <w:sz w:val="28"/>
-          <w:szCs w:val="28"/>
-          <w:shd w:val="clear" w:color="auto" w:fill="FFFFFF"/>
-        </w:rPr>
-        <w:t>важные файлы для резервирования: </w:t>
+        <w:t>Обслуживание включает регулярное резервное копирование исходного кода и конфигурации, а также обновление зависимостей. Критически важные файлы для резервирования: </w:t>
       </w:r>
       <w:r>
         <w:rPr>
@@ -11296,16 +11227,7 @@
           <w:szCs w:val="28"/>
           <w:shd w:val="clear" w:color="auto" w:fill="FFFFFF"/>
         </w:rPr>
-        <w:t xml:space="preserve"> добавить строку с названием кабинета и его координатами (x, y). Для </w:t>
-      </w:r>
-      <w:r>
-        <w:rPr>
-          <w:color w:val="000000"/>
-          <w:sz w:val="28"/>
-          <w:szCs w:val="28"/>
-          <w:shd w:val="clear" w:color="auto" w:fill="FFFFFF"/>
-        </w:rPr>
-        <w:t xml:space="preserve">добавления связи помещения с </w:t>
+        <w:t xml:space="preserve"> добавить строку с названием кабинета и его координатами (x, y). Для добавления связи помещения с </w:t>
       </w:r>
       <w:r>
         <w:rPr>
@@ -11433,16 +11355,7 @@
           <w:szCs w:val="28"/>
           <w:shd w:val="clear" w:color="auto" w:fill="FFFFFF"/>
         </w:rPr>
-        <w:t>если порт</w:t>
-      </w:r>
-      <w:r>
-        <w:rPr>
-          <w:color w:val="000000"/>
-          <w:sz w:val="28"/>
-          <w:szCs w:val="28"/>
-          <w:shd w:val="clear" w:color="auto" w:fill="FFFFFF"/>
-        </w:rPr>
-        <w:t xml:space="preserve"> 8001 занят, найдите и завершите процесс, использующий порт, или измените порт в </w:t>
+        <w:t>если порт 8001 занят, найдите и завершите процесс, использующий порт, или измените порт в </w:t>
       </w:r>
       <w:r>
         <w:rPr>
@@ -11601,16 +11514,7 @@
           <w:szCs w:val="28"/>
           <w:shd w:val="clear" w:color="auto" w:fill="FFFFFF"/>
         </w:rPr>
-        <w:t>если маршрут строится неправильн</w:t>
-      </w:r>
-      <w:r>
-        <w:rPr>
-          <w:color w:val="000000"/>
-          <w:sz w:val="28"/>
-          <w:szCs w:val="28"/>
-          <w:shd w:val="clear" w:color="auto" w:fill="FFFFFF"/>
-        </w:rPr>
-        <w:t>о, проверьте граф в </w:t>
+        <w:t>если маршрут строится неправильно, проверьте граф в </w:t>
       </w:r>
       <w:r>
         <w:rPr>
@@ -11699,8 +11603,9 @@
           <w:sz w:val="28"/>
           <w:szCs w:val="28"/>
         </w:rPr>
-        <w:t>s</w:t>
-      </w:r>
+        <w:t>script</w:t>
+      </w:r>
+      <w:proofErr w:type="spellEnd"/>
       <w:r>
         <w:rPr>
           <w:rStyle w:val="af5"/>
@@ -11708,9 +11613,15 @@
           <w:sz w:val="28"/>
           <w:szCs w:val="28"/>
         </w:rPr>
-        <w:t>cript</w:t>
-      </w:r>
-      <w:proofErr w:type="spellEnd"/>
+        <w:t>), map_floor2.jpg и map_floor3.jpg (карты 2-го и 3-го этажей), requirements.txt (список зависимостей). Резервное копирование следует выполнять после любых изменений в коде и перед обновлением версии.</w:t>
+      </w:r>
+    </w:p>
+    <w:p>
+      <w:pPr>
+        <w:spacing w:line="360" w:lineRule="auto"/>
+        <w:ind w:firstLine="709"/>
+        <w:jc w:val="both"/>
+      </w:pPr>
       <w:r>
         <w:rPr>
           <w:rStyle w:val="af5"/>
@@ -11718,32 +11629,7 @@
           <w:sz w:val="28"/>
           <w:szCs w:val="28"/>
         </w:rPr>
-        <w:t>), map_floor2.jpg и map_floor3.jpg (карты 2-го и 3-го этажей), requirements.txt (список зависимостей). Резервное копирование следует выполнять после любых изменений в коде и перед обновлением версии.</w:t>
-      </w:r>
-    </w:p>
-    <w:p>
-      <w:pPr>
-        <w:spacing w:line="360" w:lineRule="auto"/>
-        <w:ind w:firstLine="709"/>
-        <w:jc w:val="both"/>
-      </w:pPr>
-      <w:r>
-        <w:rPr>
-          <w:rStyle w:val="af5"/>
-          <w:rFonts w:ascii="Times New Roman" w:hAnsi="Times New Roman"/>
-          <w:sz w:val="28"/>
-          <w:szCs w:val="28"/>
-        </w:rPr>
-        <w:t>В случае потери данных восстановите файлы из резерв</w:t>
-      </w:r>
-      <w:r>
-        <w:rPr>
-          <w:rStyle w:val="af5"/>
-          <w:rFonts w:ascii="Times New Roman" w:hAnsi="Times New Roman"/>
-          <w:sz w:val="28"/>
-          <w:szCs w:val="28"/>
-        </w:rPr>
-        <w:t>ной копии, переустановите зависимости командой </w:t>
+        <w:t>В случае потери данных восстановите файлы из резервной копии, переустановите зависимости командой </w:t>
       </w:r>
       <w:proofErr w:type="spellStart"/>
       <w:r>
@@ -11886,18 +11772,7 @@
           <w:szCs w:val="28"/>
           <w:shd w:val="clear" w:color="auto" w:fill="FFFFFF"/>
         </w:rPr>
-        <w:t xml:space="preserve">избегайте запуска приложения </w:t>
-      </w:r>
-      <w:r>
-        <w:rPr>
-          <w:rStyle w:val="af5"/>
-          <w:rFonts w:ascii="Times New Roman" w:hAnsi="Times New Roman" w:cs="Times New Roman"/>
-          <w:color w:val="000000"/>
-          <w:sz w:val="28"/>
-          <w:szCs w:val="28"/>
-          <w:shd w:val="clear" w:color="auto" w:fill="FFFFFF"/>
-        </w:rPr>
-        <w:t xml:space="preserve">на порту, который уже используется другими приложениями; </w:t>
+        <w:t xml:space="preserve">избегайте запуска приложения на порту, который уже используется другими приложениями; </w:t>
       </w:r>
     </w:p>
     <w:p>
@@ -12115,14 +11990,7 @@
           <w:sz w:val="28"/>
           <w:szCs w:val="28"/>
         </w:rPr>
-        <w:t>ручное функциональное тестирование программного обеспечения (для выявления ошибок</w:t>
-      </w:r>
-      <w:r>
-        <w:rPr>
-          <w:sz w:val="28"/>
-          <w:szCs w:val="28"/>
-        </w:rPr>
-        <w:t xml:space="preserve"> и дефектов);</w:t>
+        <w:t>ручное функциональное тестирование программного обеспечения (для выявления ошибок и дефектов);</w:t>
       </w:r>
     </w:p>
     <w:p>
@@ -12251,15 +12119,7 @@
           <w:sz w:val="28"/>
           <w:szCs w:val="28"/>
         </w:rPr>
-        <w:t>В рамках настоящего технического задания были сформулированы все необходимые требования к созданию навигатора для кампуса РТУ МИРЭА на ул. Стромынка. Все поставленные цели и задачи были последовательно реализованы: определены функциональное наз</w:t>
-      </w:r>
-      <w:r>
-        <w:rPr>
-          <w:color w:val="000000"/>
-          <w:sz w:val="28"/>
-          <w:szCs w:val="28"/>
-        </w:rPr>
-        <w:t>начение, условия эксплуатации, критерии надежности и четкий порядок приемки продукта. Разработанное программное изделие полностью соответствует заявленным требованиям, успешно прошло предусмотренные испытания и </w:t>
+        <w:t>В рамках настоящего технического задания были сформулированы все необходимые требования к созданию навигатора для кампуса РТУ МИРЭА на ул. Стромынка. Все поставленные цели и задачи были последовательно реализованы: определены функциональное назначение, условия эксплуатации, критерии надежности и четкий порядок приемки продукта. Разработанное программное изделие полностью соответствует заявленным требованиям, успешно прошло предусмотренные испытания и </w:t>
       </w:r>
       <w:r>
         <w:rPr>
@@ -12277,15 +12137,7 @@
           <w:sz w:val="28"/>
           <w:szCs w:val="28"/>
         </w:rPr>
-        <w:t>. Таким образом,</w:t>
-      </w:r>
-      <w:r>
-        <w:rPr>
-          <w:color w:val="000000"/>
-          <w:sz w:val="28"/>
-          <w:szCs w:val="28"/>
-        </w:rPr>
-        <w:t xml:space="preserve"> проект завершён успешно, а его результат — удобный и современный навигационный инструмент — готов к использованию студентами, преподавателями и гостями университета для быстрого и комфортного ориентирования в пространстве кампуса.</w:t>
+        <w:t>. Таким образом, проект завершён успешно, а его результат — удобный и современный навигационный инструмент — готов к использованию студентами, преподавателями и гостями университета для быстрого и комфортного ориентирования в пространстве кампуса.</w:t>
       </w:r>
       <w:r>
         <w:br w:type="page"/>
@@ -12326,15 +12178,7 @@
           <w:szCs w:val="28"/>
           <w:lang w:val="en-US"/>
         </w:rPr>
-        <w:t>«Tut</w:t>
-      </w:r>
-      <w:r>
-        <w:rPr>
-          <w:sz w:val="28"/>
-          <w:szCs w:val="28"/>
-          <w:lang w:val="en-US"/>
-        </w:rPr>
-        <w:t xml:space="preserve">orial — </w:t>
+        <w:t xml:space="preserve">«Tutorial — </w:t>
       </w:r>
       <w:proofErr w:type="spellStart"/>
       <w:r>
@@ -12431,14 +12275,7 @@
           <w:sz w:val="28"/>
           <w:szCs w:val="28"/>
         </w:rPr>
-        <w:t>электронны</w:t>
-      </w:r>
-      <w:r>
-        <w:rPr>
-          <w:sz w:val="28"/>
-          <w:szCs w:val="28"/>
-        </w:rPr>
-        <w:t>й</w:t>
+        <w:t>электронный</w:t>
       </w:r>
       <w:r>
         <w:rPr>
@@ -12712,18 +12549,7 @@
           <w:u w:val="none"/>
           <w:lang w:val="en-US"/>
         </w:rPr>
-        <w:t>«Flask-CORS — Flask-CORS 5.0.0 documentatio</w:t>
-      </w:r>
-      <w:r>
-        <w:rPr>
-          <w:rStyle w:val="af"/>
-          <w:color w:val="000000"/>
-          <w:sz w:val="28"/>
-          <w:szCs w:val="28"/>
-          <w:u w:val="none"/>
-          <w:lang w:val="en-US"/>
-        </w:rPr>
-        <w:t>n» [</w:t>
+        <w:t>«Flask-CORS — Flask-CORS 5.0.0 documentation» [</w:t>
       </w:r>
       <w:r>
         <w:rPr>
@@ -12984,17 +12810,7 @@
           <w:szCs w:val="28"/>
           <w:u w:val="none"/>
         </w:rPr>
-        <w:t>«HT</w:t>
-      </w:r>
-      <w:r>
-        <w:rPr>
-          <w:rStyle w:val="af"/>
-          <w:color w:val="000000"/>
-          <w:sz w:val="28"/>
-          <w:szCs w:val="28"/>
-          <w:u w:val="none"/>
-        </w:rPr>
-        <w:t xml:space="preserve">TP — MDN </w:t>
+        <w:t xml:space="preserve">«HTTP — MDN </w:t>
       </w:r>
       <w:proofErr w:type="spellStart"/>
       <w:r>
@@ -13103,17 +12919,7 @@
           <w:szCs w:val="28"/>
           <w:u w:val="none"/>
         </w:rPr>
-        <w:t>, Реми Шарп. Изучаем HTML5. Библиотека специалиста [текст]: информационно-методическ</w:t>
-      </w:r>
-      <w:r>
-        <w:rPr>
-          <w:rStyle w:val="af"/>
-          <w:color w:val="000000"/>
-          <w:sz w:val="28"/>
-          <w:szCs w:val="28"/>
-          <w:u w:val="none"/>
-        </w:rPr>
-        <w:t>ое пособие. СПб.: Питер, 2012. - 304 с.</w:t>
+        <w:t>, Реми Шарп. Изучаем HTML5. Библиотека специалиста [текст]: информационно-методическое пособие. СПб.: Питер, 2012. - 304 с.</w:t>
       </w:r>
     </w:p>
     <w:p>
@@ -13221,17 +13027,7 @@
           <w:szCs w:val="28"/>
           <w:u w:val="none"/>
         </w:rPr>
-        <w:t xml:space="preserve">. HTML5 и CSS3. Разработка сайтов для любых браузеров и устройств [текст]: </w:t>
-      </w:r>
-      <w:r>
-        <w:rPr>
-          <w:rStyle w:val="af"/>
-          <w:color w:val="000000"/>
-          <w:sz w:val="28"/>
-          <w:szCs w:val="28"/>
-          <w:u w:val="none"/>
-        </w:rPr>
-        <w:t>информационно-методическое пособие. СПб.:</w:t>
+        <w:t>. HTML5 и CSS3. Разработка сайтов для любых браузеров и устройств [текст]: информационно-методическое пособие. СПб.:</w:t>
       </w:r>
       <w:r>
         <w:rPr>
@@ -17194,7 +16990,7 @@
 </file>
 
 <file path=customXml/itemProps1.xml><?xml version="1.0" encoding="utf-8"?>
-<ds:datastoreItem xmlns:ds="http://schemas.openxmlformats.org/officeDocument/2006/customXml" ds:itemID="{4B84A874-B20B-44BB-BCFE-4B31D022E949}">
+<ds:datastoreItem xmlns:ds="http://schemas.openxmlformats.org/officeDocument/2006/customXml" ds:itemID="{38A8240C-6681-46DC-8EC6-9C783D981786}">
   <ds:schemaRefs>
     <ds:schemaRef ds:uri="http://schemas.openxmlformats.org/officeDocument/2006/bibliography"/>
   </ds:schemaRefs>

</xml_diff>